<commit_message>
flask and mongodb add
</commit_message>
<xml_diff>
--- a/DevOps/Python-Assignment-02/Python-Assignment-02.docx
+++ b/DevOps/Python-Assignment-02/Python-Assignment-02.docx
@@ -675,10 +675,22 @@
         <w:spacing w:after="0" w:line="360" w:lineRule="auto"/>
         <w:rPr>
           <w:rFonts w:ascii="Times New Roman" w:hAnsi="Times New Roman" w:cs="Times New Roman"/>
-          <w:sz w:val="24"/>
-          <w:szCs w:val="24"/>
-        </w:rPr>
-      </w:pPr>
+          <w:b/>
+          <w:bCs/>
+          <w:sz w:val="24"/>
+          <w:szCs w:val="24"/>
+        </w:rPr>
+      </w:pPr>
+      <w:r>
+        <w:rPr>
+          <w:rFonts w:ascii="Times New Roman" w:hAnsi="Times New Roman" w:cs="Times New Roman"/>
+          <w:b/>
+          <w:bCs/>
+          <w:sz w:val="24"/>
+          <w:szCs w:val="24"/>
+        </w:rPr>
+        <w:t>2 Student Grades</w:t>
+      </w:r>
     </w:p>
     <w:p>
       <w:pPr>
@@ -691,6 +703,16 @@
           <w:szCs w:val="24"/>
         </w:rPr>
       </w:pPr>
+      <w:r>
+        <w:rPr>
+          <w:rFonts w:ascii="Times New Roman" w:hAnsi="Times New Roman" w:cs="Times New Roman"/>
+          <w:b/>
+          <w:bCs/>
+          <w:sz w:val="24"/>
+          <w:szCs w:val="24"/>
+        </w:rPr>
+        <w:t>Create a dictionary where the keys are student names and the values are their grades. Allow the user to:</w:t>
+      </w:r>
     </w:p>
     <w:p>
       <w:pPr>
@@ -711,7 +733,7 @@
           <w:sz w:val="24"/>
           <w:szCs w:val="24"/>
         </w:rPr>
-        <w:t>2 Student Grades</w:t>
+        <w:t>Add a new student and grade.</w:t>
       </w:r>
     </w:p>
     <w:p>
@@ -733,7 +755,7 @@
           <w:sz w:val="24"/>
           <w:szCs w:val="24"/>
         </w:rPr>
-        <w:t>Create a dictionary where the keys are student names and the values are their grades. Allow the user to:</w:t>
+        <w:t>Update an existing student’s grade.</w:t>
       </w:r>
     </w:p>
     <w:p>
@@ -755,7 +777,7 @@
           <w:sz w:val="24"/>
           <w:szCs w:val="24"/>
         </w:rPr>
-        <w:t>Add a new student and grade.</w:t>
+        <w:t>Print all student grades.</w:t>
       </w:r>
     </w:p>
     <w:p>
@@ -777,7 +799,992 @@
           <w:sz w:val="24"/>
           <w:szCs w:val="24"/>
         </w:rPr>
-        <w:t>Update an existing student’s grade.</w:t>
+        <w:t>Ans:</w:t>
+      </w:r>
+    </w:p>
+    <w:p>
+      <w:pPr>
+        <w:spacing w:after="0" w:line="240" w:lineRule="auto"/>
+        <w:rPr>
+          <w:rFonts w:ascii="Times New Roman" w:hAnsi="Times New Roman" w:cs="Times New Roman"/>
+          <w:sz w:val="24"/>
+          <w:szCs w:val="24"/>
+        </w:rPr>
+      </w:pPr>
+      <w:r>
+        <w:rPr>
+          <w:rFonts w:ascii="Times New Roman" w:hAnsi="Times New Roman" w:cs="Times New Roman"/>
+          <w:sz w:val="24"/>
+          <w:szCs w:val="24"/>
+        </w:rPr>
+        <w:t>students = {}</w:t>
+      </w:r>
+    </w:p>
+    <w:p>
+      <w:pPr>
+        <w:spacing w:after="0" w:line="240" w:lineRule="auto"/>
+        <w:rPr>
+          <w:rFonts w:ascii="Times New Roman" w:hAnsi="Times New Roman" w:cs="Times New Roman"/>
+          <w:sz w:val="24"/>
+          <w:szCs w:val="24"/>
+        </w:rPr>
+      </w:pPr>
+      <w:r>
+        <w:rPr>
+          <w:rFonts w:ascii="Times New Roman" w:hAnsi="Times New Roman" w:cs="Times New Roman"/>
+          <w:sz w:val="24"/>
+          <w:szCs w:val="24"/>
+        </w:rPr>
+        <w:t>while True:</w:t>
+      </w:r>
+    </w:p>
+    <w:p>
+      <w:pPr>
+        <w:spacing w:after="0" w:line="240" w:lineRule="auto"/>
+        <w:rPr>
+          <w:rFonts w:ascii="Times New Roman" w:hAnsi="Times New Roman" w:cs="Times New Roman"/>
+          <w:sz w:val="24"/>
+          <w:szCs w:val="24"/>
+        </w:rPr>
+      </w:pPr>
+      <w:r>
+        <w:rPr>
+          <w:rFonts w:ascii="Times New Roman" w:hAnsi="Times New Roman" w:cs="Times New Roman"/>
+          <w:sz w:val="24"/>
+          <w:szCs w:val="24"/>
+        </w:rPr>
+        <w:t xml:space="preserve">    </w:t>
+      </w:r>
+      <w:proofErr w:type="gramStart"/>
+      <w:r>
+        <w:rPr>
+          <w:rFonts w:ascii="Times New Roman" w:hAnsi="Times New Roman" w:cs="Times New Roman"/>
+          <w:sz w:val="24"/>
+          <w:szCs w:val="24"/>
+        </w:rPr>
+        <w:t>print(</w:t>
+      </w:r>
+      <w:proofErr w:type="gramEnd"/>
+      <w:r>
+        <w:rPr>
+          <w:rFonts w:ascii="Times New Roman" w:hAnsi="Times New Roman" w:cs="Times New Roman"/>
+          <w:sz w:val="24"/>
+          <w:szCs w:val="24"/>
+        </w:rPr>
+        <w:t>"\n1. Add Student")</w:t>
+      </w:r>
+    </w:p>
+    <w:p>
+      <w:pPr>
+        <w:spacing w:after="0" w:line="240" w:lineRule="auto"/>
+        <w:rPr>
+          <w:rFonts w:ascii="Times New Roman" w:hAnsi="Times New Roman" w:cs="Times New Roman"/>
+          <w:sz w:val="24"/>
+          <w:szCs w:val="24"/>
+        </w:rPr>
+      </w:pPr>
+      <w:r>
+        <w:rPr>
+          <w:rFonts w:ascii="Times New Roman" w:hAnsi="Times New Roman" w:cs="Times New Roman"/>
+          <w:sz w:val="24"/>
+          <w:szCs w:val="24"/>
+        </w:rPr>
+        <w:t xml:space="preserve">    </w:t>
+      </w:r>
+      <w:proofErr w:type="gramStart"/>
+      <w:r>
+        <w:rPr>
+          <w:rFonts w:ascii="Times New Roman" w:hAnsi="Times New Roman" w:cs="Times New Roman"/>
+          <w:sz w:val="24"/>
+          <w:szCs w:val="24"/>
+        </w:rPr>
+        <w:t>print(</w:t>
+      </w:r>
+      <w:proofErr w:type="gramEnd"/>
+      <w:r>
+        <w:rPr>
+          <w:rFonts w:ascii="Times New Roman" w:hAnsi="Times New Roman" w:cs="Times New Roman"/>
+          <w:sz w:val="24"/>
+          <w:szCs w:val="24"/>
+        </w:rPr>
+        <w:t>"2. Update Student Grade")</w:t>
+      </w:r>
+    </w:p>
+    <w:p>
+      <w:pPr>
+        <w:spacing w:after="0" w:line="240" w:lineRule="auto"/>
+        <w:rPr>
+          <w:rFonts w:ascii="Times New Roman" w:hAnsi="Times New Roman" w:cs="Times New Roman"/>
+          <w:sz w:val="24"/>
+          <w:szCs w:val="24"/>
+        </w:rPr>
+      </w:pPr>
+      <w:r>
+        <w:rPr>
+          <w:rFonts w:ascii="Times New Roman" w:hAnsi="Times New Roman" w:cs="Times New Roman"/>
+          <w:sz w:val="24"/>
+          <w:szCs w:val="24"/>
+        </w:rPr>
+        <w:t xml:space="preserve">    </w:t>
+      </w:r>
+      <w:proofErr w:type="gramStart"/>
+      <w:r>
+        <w:rPr>
+          <w:rFonts w:ascii="Times New Roman" w:hAnsi="Times New Roman" w:cs="Times New Roman"/>
+          <w:sz w:val="24"/>
+          <w:szCs w:val="24"/>
+        </w:rPr>
+        <w:t>print(</w:t>
+      </w:r>
+      <w:proofErr w:type="gramEnd"/>
+      <w:r>
+        <w:rPr>
+          <w:rFonts w:ascii="Times New Roman" w:hAnsi="Times New Roman" w:cs="Times New Roman"/>
+          <w:sz w:val="24"/>
+          <w:szCs w:val="24"/>
+        </w:rPr>
+        <w:t>"3. Print All Students")</w:t>
+      </w:r>
+    </w:p>
+    <w:p>
+      <w:pPr>
+        <w:spacing w:after="0" w:line="240" w:lineRule="auto"/>
+        <w:rPr>
+          <w:rFonts w:ascii="Times New Roman" w:hAnsi="Times New Roman" w:cs="Times New Roman"/>
+          <w:sz w:val="24"/>
+          <w:szCs w:val="24"/>
+        </w:rPr>
+      </w:pPr>
+      <w:r>
+        <w:rPr>
+          <w:rFonts w:ascii="Times New Roman" w:hAnsi="Times New Roman" w:cs="Times New Roman"/>
+          <w:sz w:val="24"/>
+          <w:szCs w:val="24"/>
+        </w:rPr>
+        <w:t xml:space="preserve">    </w:t>
+      </w:r>
+      <w:proofErr w:type="gramStart"/>
+      <w:r>
+        <w:rPr>
+          <w:rFonts w:ascii="Times New Roman" w:hAnsi="Times New Roman" w:cs="Times New Roman"/>
+          <w:sz w:val="24"/>
+          <w:szCs w:val="24"/>
+        </w:rPr>
+        <w:t>print(</w:t>
+      </w:r>
+      <w:proofErr w:type="gramEnd"/>
+      <w:r>
+        <w:rPr>
+          <w:rFonts w:ascii="Times New Roman" w:hAnsi="Times New Roman" w:cs="Times New Roman"/>
+          <w:sz w:val="24"/>
+          <w:szCs w:val="24"/>
+        </w:rPr>
+        <w:t>"4. Exit")</w:t>
+      </w:r>
+    </w:p>
+    <w:p>
+      <w:pPr>
+        <w:spacing w:after="0" w:line="240" w:lineRule="auto"/>
+        <w:rPr>
+          <w:rFonts w:ascii="Times New Roman" w:hAnsi="Times New Roman" w:cs="Times New Roman"/>
+          <w:sz w:val="24"/>
+          <w:szCs w:val="24"/>
+        </w:rPr>
+      </w:pPr>
+    </w:p>
+    <w:p>
+      <w:pPr>
+        <w:spacing w:after="0" w:line="240" w:lineRule="auto"/>
+        <w:rPr>
+          <w:rFonts w:ascii="Times New Roman" w:hAnsi="Times New Roman" w:cs="Times New Roman"/>
+          <w:sz w:val="24"/>
+          <w:szCs w:val="24"/>
+        </w:rPr>
+      </w:pPr>
+      <w:r>
+        <w:rPr>
+          <w:rFonts w:ascii="Times New Roman" w:hAnsi="Times New Roman" w:cs="Times New Roman"/>
+          <w:sz w:val="24"/>
+          <w:szCs w:val="24"/>
+        </w:rPr>
+        <w:t xml:space="preserve">    choice = </w:t>
+      </w:r>
+      <w:proofErr w:type="gramStart"/>
+      <w:r>
+        <w:rPr>
+          <w:rFonts w:ascii="Times New Roman" w:hAnsi="Times New Roman" w:cs="Times New Roman"/>
+          <w:sz w:val="24"/>
+          <w:szCs w:val="24"/>
+        </w:rPr>
+        <w:t>input(</w:t>
+      </w:r>
+      <w:proofErr w:type="gramEnd"/>
+      <w:r>
+        <w:rPr>
+          <w:rFonts w:ascii="Times New Roman" w:hAnsi="Times New Roman" w:cs="Times New Roman"/>
+          <w:sz w:val="24"/>
+          <w:szCs w:val="24"/>
+        </w:rPr>
+        <w:t>"Enter your choice: ")</w:t>
+      </w:r>
+    </w:p>
+    <w:p>
+      <w:pPr>
+        <w:spacing w:after="0" w:line="240" w:lineRule="auto"/>
+        <w:rPr>
+          <w:rFonts w:ascii="Times New Roman" w:hAnsi="Times New Roman" w:cs="Times New Roman"/>
+          <w:sz w:val="24"/>
+          <w:szCs w:val="24"/>
+        </w:rPr>
+      </w:pPr>
+      <w:r>
+        <w:rPr>
+          <w:rFonts w:ascii="Times New Roman" w:hAnsi="Times New Roman" w:cs="Times New Roman"/>
+          <w:sz w:val="24"/>
+          <w:szCs w:val="24"/>
+        </w:rPr>
+        <w:t>    if choice == "1":</w:t>
+      </w:r>
+    </w:p>
+    <w:p>
+      <w:pPr>
+        <w:spacing w:after="0" w:line="240" w:lineRule="auto"/>
+        <w:rPr>
+          <w:rFonts w:ascii="Times New Roman" w:hAnsi="Times New Roman" w:cs="Times New Roman"/>
+          <w:sz w:val="24"/>
+          <w:szCs w:val="24"/>
+        </w:rPr>
+      </w:pPr>
+      <w:r>
+        <w:rPr>
+          <w:rFonts w:ascii="Times New Roman" w:hAnsi="Times New Roman" w:cs="Times New Roman"/>
+          <w:sz w:val="24"/>
+          <w:szCs w:val="24"/>
+        </w:rPr>
+        <w:t xml:space="preserve">        name = </w:t>
+      </w:r>
+      <w:proofErr w:type="gramStart"/>
+      <w:r>
+        <w:rPr>
+          <w:rFonts w:ascii="Times New Roman" w:hAnsi="Times New Roman" w:cs="Times New Roman"/>
+          <w:sz w:val="24"/>
+          <w:szCs w:val="24"/>
+        </w:rPr>
+        <w:t>input(</w:t>
+      </w:r>
+      <w:proofErr w:type="gramEnd"/>
+      <w:r>
+        <w:rPr>
+          <w:rFonts w:ascii="Times New Roman" w:hAnsi="Times New Roman" w:cs="Times New Roman"/>
+          <w:sz w:val="24"/>
+          <w:szCs w:val="24"/>
+        </w:rPr>
+        <w:t>"Enter student name: ")</w:t>
+      </w:r>
+    </w:p>
+    <w:p>
+      <w:pPr>
+        <w:spacing w:after="0" w:line="240" w:lineRule="auto"/>
+        <w:rPr>
+          <w:rFonts w:ascii="Times New Roman" w:hAnsi="Times New Roman" w:cs="Times New Roman"/>
+          <w:sz w:val="24"/>
+          <w:szCs w:val="24"/>
+        </w:rPr>
+      </w:pPr>
+      <w:r>
+        <w:rPr>
+          <w:rFonts w:ascii="Times New Roman" w:hAnsi="Times New Roman" w:cs="Times New Roman"/>
+          <w:sz w:val="24"/>
+          <w:szCs w:val="24"/>
+        </w:rPr>
+        <w:t xml:space="preserve">        grade = </w:t>
+      </w:r>
+      <w:proofErr w:type="gramStart"/>
+      <w:r>
+        <w:rPr>
+          <w:rFonts w:ascii="Times New Roman" w:hAnsi="Times New Roman" w:cs="Times New Roman"/>
+          <w:sz w:val="24"/>
+          <w:szCs w:val="24"/>
+        </w:rPr>
+        <w:t>input(</w:t>
+      </w:r>
+      <w:proofErr w:type="gramEnd"/>
+      <w:r>
+        <w:rPr>
+          <w:rFonts w:ascii="Times New Roman" w:hAnsi="Times New Roman" w:cs="Times New Roman"/>
+          <w:sz w:val="24"/>
+          <w:szCs w:val="24"/>
+        </w:rPr>
+        <w:t>"Enter grade: ")</w:t>
+      </w:r>
+    </w:p>
+    <w:p>
+      <w:pPr>
+        <w:spacing w:after="0" w:line="240" w:lineRule="auto"/>
+        <w:rPr>
+          <w:rFonts w:ascii="Times New Roman" w:hAnsi="Times New Roman" w:cs="Times New Roman"/>
+          <w:sz w:val="24"/>
+          <w:szCs w:val="24"/>
+        </w:rPr>
+      </w:pPr>
+      <w:r>
+        <w:rPr>
+          <w:rFonts w:ascii="Times New Roman" w:hAnsi="Times New Roman" w:cs="Times New Roman"/>
+          <w:sz w:val="24"/>
+          <w:szCs w:val="24"/>
+        </w:rPr>
+        <w:t>        students[name] = grade</w:t>
+      </w:r>
+    </w:p>
+    <w:p>
+      <w:pPr>
+        <w:spacing w:after="0" w:line="240" w:lineRule="auto"/>
+        <w:rPr>
+          <w:rFonts w:ascii="Times New Roman" w:hAnsi="Times New Roman" w:cs="Times New Roman"/>
+          <w:sz w:val="24"/>
+          <w:szCs w:val="24"/>
+        </w:rPr>
+      </w:pPr>
+      <w:r>
+        <w:rPr>
+          <w:rFonts w:ascii="Times New Roman" w:hAnsi="Times New Roman" w:cs="Times New Roman"/>
+          <w:sz w:val="24"/>
+          <w:szCs w:val="24"/>
+        </w:rPr>
+        <w:t xml:space="preserve">        </w:t>
+      </w:r>
+      <w:proofErr w:type="gramStart"/>
+      <w:r>
+        <w:rPr>
+          <w:rFonts w:ascii="Times New Roman" w:hAnsi="Times New Roman" w:cs="Times New Roman"/>
+          <w:sz w:val="24"/>
+          <w:szCs w:val="24"/>
+        </w:rPr>
+        <w:t>print(</w:t>
+      </w:r>
+      <w:proofErr w:type="gramEnd"/>
+      <w:r>
+        <w:rPr>
+          <w:rFonts w:ascii="Times New Roman" w:hAnsi="Times New Roman" w:cs="Times New Roman"/>
+          <w:sz w:val="24"/>
+          <w:szCs w:val="24"/>
+        </w:rPr>
+        <w:t>"Student added successfully.")</w:t>
+      </w:r>
+    </w:p>
+    <w:p>
+      <w:pPr>
+        <w:spacing w:after="0" w:line="240" w:lineRule="auto"/>
+        <w:rPr>
+          <w:rFonts w:ascii="Times New Roman" w:hAnsi="Times New Roman" w:cs="Times New Roman"/>
+          <w:sz w:val="24"/>
+          <w:szCs w:val="24"/>
+        </w:rPr>
+      </w:pPr>
+      <w:r>
+        <w:rPr>
+          <w:rFonts w:ascii="Times New Roman" w:hAnsi="Times New Roman" w:cs="Times New Roman"/>
+          <w:sz w:val="24"/>
+          <w:szCs w:val="24"/>
+        </w:rPr>
+        <w:t xml:space="preserve">    </w:t>
+      </w:r>
+      <w:proofErr w:type="spellStart"/>
+      <w:r>
+        <w:rPr>
+          <w:rFonts w:ascii="Times New Roman" w:hAnsi="Times New Roman" w:cs="Times New Roman"/>
+          <w:sz w:val="24"/>
+          <w:szCs w:val="24"/>
+        </w:rPr>
+        <w:t>elif</w:t>
+      </w:r>
+      <w:proofErr w:type="spellEnd"/>
+      <w:r>
+        <w:rPr>
+          <w:rFonts w:ascii="Times New Roman" w:hAnsi="Times New Roman" w:cs="Times New Roman"/>
+          <w:sz w:val="24"/>
+          <w:szCs w:val="24"/>
+        </w:rPr>
+        <w:t xml:space="preserve"> choice == "2":</w:t>
+      </w:r>
+    </w:p>
+    <w:p>
+      <w:pPr>
+        <w:spacing w:after="0" w:line="240" w:lineRule="auto"/>
+        <w:rPr>
+          <w:rFonts w:ascii="Times New Roman" w:hAnsi="Times New Roman" w:cs="Times New Roman"/>
+          <w:sz w:val="24"/>
+          <w:szCs w:val="24"/>
+        </w:rPr>
+      </w:pPr>
+      <w:r>
+        <w:rPr>
+          <w:rFonts w:ascii="Times New Roman" w:hAnsi="Times New Roman" w:cs="Times New Roman"/>
+          <w:sz w:val="24"/>
+          <w:szCs w:val="24"/>
+        </w:rPr>
+        <w:t xml:space="preserve">        name = </w:t>
+      </w:r>
+      <w:proofErr w:type="gramStart"/>
+      <w:r>
+        <w:rPr>
+          <w:rFonts w:ascii="Times New Roman" w:hAnsi="Times New Roman" w:cs="Times New Roman"/>
+          <w:sz w:val="24"/>
+          <w:szCs w:val="24"/>
+        </w:rPr>
+        <w:t>input(</w:t>
+      </w:r>
+      <w:proofErr w:type="gramEnd"/>
+      <w:r>
+        <w:rPr>
+          <w:rFonts w:ascii="Times New Roman" w:hAnsi="Times New Roman" w:cs="Times New Roman"/>
+          <w:sz w:val="24"/>
+          <w:szCs w:val="24"/>
+        </w:rPr>
+        <w:t>"Enter student name to update: ")</w:t>
+      </w:r>
+    </w:p>
+    <w:p>
+      <w:pPr>
+        <w:spacing w:after="0" w:line="240" w:lineRule="auto"/>
+        <w:rPr>
+          <w:rFonts w:ascii="Times New Roman" w:hAnsi="Times New Roman" w:cs="Times New Roman"/>
+          <w:sz w:val="24"/>
+          <w:szCs w:val="24"/>
+        </w:rPr>
+      </w:pPr>
+      <w:r>
+        <w:rPr>
+          <w:rFonts w:ascii="Times New Roman" w:hAnsi="Times New Roman" w:cs="Times New Roman"/>
+          <w:sz w:val="24"/>
+          <w:szCs w:val="24"/>
+        </w:rPr>
+        <w:t>        if name in students:</w:t>
+      </w:r>
+    </w:p>
+    <w:p>
+      <w:pPr>
+        <w:spacing w:after="0" w:line="240" w:lineRule="auto"/>
+        <w:rPr>
+          <w:rFonts w:ascii="Times New Roman" w:hAnsi="Times New Roman" w:cs="Times New Roman"/>
+          <w:sz w:val="24"/>
+          <w:szCs w:val="24"/>
+        </w:rPr>
+      </w:pPr>
+      <w:r>
+        <w:rPr>
+          <w:rFonts w:ascii="Times New Roman" w:hAnsi="Times New Roman" w:cs="Times New Roman"/>
+          <w:sz w:val="24"/>
+          <w:szCs w:val="24"/>
+        </w:rPr>
+        <w:t xml:space="preserve">            grade = </w:t>
+      </w:r>
+      <w:proofErr w:type="gramStart"/>
+      <w:r>
+        <w:rPr>
+          <w:rFonts w:ascii="Times New Roman" w:hAnsi="Times New Roman" w:cs="Times New Roman"/>
+          <w:sz w:val="24"/>
+          <w:szCs w:val="24"/>
+        </w:rPr>
+        <w:t>input(</w:t>
+      </w:r>
+      <w:proofErr w:type="gramEnd"/>
+      <w:r>
+        <w:rPr>
+          <w:rFonts w:ascii="Times New Roman" w:hAnsi="Times New Roman" w:cs="Times New Roman"/>
+          <w:sz w:val="24"/>
+          <w:szCs w:val="24"/>
+        </w:rPr>
+        <w:t>"Enter new grade: ")</w:t>
+      </w:r>
+    </w:p>
+    <w:p>
+      <w:pPr>
+        <w:spacing w:after="0" w:line="240" w:lineRule="auto"/>
+        <w:rPr>
+          <w:rFonts w:ascii="Times New Roman" w:hAnsi="Times New Roman" w:cs="Times New Roman"/>
+          <w:sz w:val="24"/>
+          <w:szCs w:val="24"/>
+        </w:rPr>
+      </w:pPr>
+      <w:r>
+        <w:rPr>
+          <w:rFonts w:ascii="Times New Roman" w:hAnsi="Times New Roman" w:cs="Times New Roman"/>
+          <w:sz w:val="24"/>
+          <w:szCs w:val="24"/>
+        </w:rPr>
+        <w:lastRenderedPageBreak/>
+        <w:t>            students[name] = grade</w:t>
+      </w:r>
+    </w:p>
+    <w:p>
+      <w:pPr>
+        <w:spacing w:after="0" w:line="240" w:lineRule="auto"/>
+        <w:rPr>
+          <w:rFonts w:ascii="Times New Roman" w:hAnsi="Times New Roman" w:cs="Times New Roman"/>
+          <w:sz w:val="24"/>
+          <w:szCs w:val="24"/>
+        </w:rPr>
+      </w:pPr>
+      <w:r>
+        <w:rPr>
+          <w:rFonts w:ascii="Times New Roman" w:hAnsi="Times New Roman" w:cs="Times New Roman"/>
+          <w:sz w:val="24"/>
+          <w:szCs w:val="24"/>
+        </w:rPr>
+        <w:t xml:space="preserve">            </w:t>
+      </w:r>
+      <w:proofErr w:type="gramStart"/>
+      <w:r>
+        <w:rPr>
+          <w:rFonts w:ascii="Times New Roman" w:hAnsi="Times New Roman" w:cs="Times New Roman"/>
+          <w:sz w:val="24"/>
+          <w:szCs w:val="24"/>
+        </w:rPr>
+        <w:t>print(</w:t>
+      </w:r>
+      <w:proofErr w:type="gramEnd"/>
+      <w:r>
+        <w:rPr>
+          <w:rFonts w:ascii="Times New Roman" w:hAnsi="Times New Roman" w:cs="Times New Roman"/>
+          <w:sz w:val="24"/>
+          <w:szCs w:val="24"/>
+        </w:rPr>
+        <w:t>"Grade updated successfully.")</w:t>
+      </w:r>
+    </w:p>
+    <w:p>
+      <w:pPr>
+        <w:spacing w:after="0" w:line="240" w:lineRule="auto"/>
+        <w:rPr>
+          <w:rFonts w:ascii="Times New Roman" w:hAnsi="Times New Roman" w:cs="Times New Roman"/>
+          <w:sz w:val="24"/>
+          <w:szCs w:val="24"/>
+        </w:rPr>
+      </w:pPr>
+      <w:r>
+        <w:rPr>
+          <w:rFonts w:ascii="Times New Roman" w:hAnsi="Times New Roman" w:cs="Times New Roman"/>
+          <w:sz w:val="24"/>
+          <w:szCs w:val="24"/>
+        </w:rPr>
+        <w:t>        else:</w:t>
+      </w:r>
+    </w:p>
+    <w:p>
+      <w:pPr>
+        <w:spacing w:after="0" w:line="240" w:lineRule="auto"/>
+        <w:rPr>
+          <w:rFonts w:ascii="Times New Roman" w:hAnsi="Times New Roman" w:cs="Times New Roman"/>
+          <w:sz w:val="24"/>
+          <w:szCs w:val="24"/>
+        </w:rPr>
+      </w:pPr>
+      <w:r>
+        <w:rPr>
+          <w:rFonts w:ascii="Times New Roman" w:hAnsi="Times New Roman" w:cs="Times New Roman"/>
+          <w:sz w:val="24"/>
+          <w:szCs w:val="24"/>
+        </w:rPr>
+        <w:t xml:space="preserve">            </w:t>
+      </w:r>
+      <w:proofErr w:type="gramStart"/>
+      <w:r>
+        <w:rPr>
+          <w:rFonts w:ascii="Times New Roman" w:hAnsi="Times New Roman" w:cs="Times New Roman"/>
+          <w:sz w:val="24"/>
+          <w:szCs w:val="24"/>
+        </w:rPr>
+        <w:t>print(</w:t>
+      </w:r>
+      <w:proofErr w:type="gramEnd"/>
+      <w:r>
+        <w:rPr>
+          <w:rFonts w:ascii="Times New Roman" w:hAnsi="Times New Roman" w:cs="Times New Roman"/>
+          <w:sz w:val="24"/>
+          <w:szCs w:val="24"/>
+        </w:rPr>
+        <w:t>"Student not found.")</w:t>
+      </w:r>
+    </w:p>
+    <w:p>
+      <w:pPr>
+        <w:spacing w:after="0" w:line="240" w:lineRule="auto"/>
+        <w:rPr>
+          <w:rFonts w:ascii="Times New Roman" w:hAnsi="Times New Roman" w:cs="Times New Roman"/>
+          <w:sz w:val="24"/>
+          <w:szCs w:val="24"/>
+        </w:rPr>
+      </w:pPr>
+      <w:r>
+        <w:rPr>
+          <w:rFonts w:ascii="Times New Roman" w:hAnsi="Times New Roman" w:cs="Times New Roman"/>
+          <w:sz w:val="24"/>
+          <w:szCs w:val="24"/>
+        </w:rPr>
+        <w:t xml:space="preserve">    </w:t>
+      </w:r>
+      <w:proofErr w:type="spellStart"/>
+      <w:r>
+        <w:rPr>
+          <w:rFonts w:ascii="Times New Roman" w:hAnsi="Times New Roman" w:cs="Times New Roman"/>
+          <w:sz w:val="24"/>
+          <w:szCs w:val="24"/>
+        </w:rPr>
+        <w:t>elif</w:t>
+      </w:r>
+      <w:proofErr w:type="spellEnd"/>
+      <w:r>
+        <w:rPr>
+          <w:rFonts w:ascii="Times New Roman" w:hAnsi="Times New Roman" w:cs="Times New Roman"/>
+          <w:sz w:val="24"/>
+          <w:szCs w:val="24"/>
+        </w:rPr>
+        <w:t xml:space="preserve"> choice == "3":</w:t>
+      </w:r>
+    </w:p>
+    <w:p>
+      <w:pPr>
+        <w:spacing w:after="0" w:line="240" w:lineRule="auto"/>
+        <w:rPr>
+          <w:rFonts w:ascii="Times New Roman" w:hAnsi="Times New Roman" w:cs="Times New Roman"/>
+          <w:sz w:val="24"/>
+          <w:szCs w:val="24"/>
+        </w:rPr>
+      </w:pPr>
+      <w:r>
+        <w:rPr>
+          <w:rFonts w:ascii="Times New Roman" w:hAnsi="Times New Roman" w:cs="Times New Roman"/>
+          <w:sz w:val="24"/>
+          <w:szCs w:val="24"/>
+        </w:rPr>
+        <w:t>        if students:</w:t>
+      </w:r>
+    </w:p>
+    <w:p>
+      <w:pPr>
+        <w:spacing w:after="0" w:line="240" w:lineRule="auto"/>
+        <w:rPr>
+          <w:rFonts w:ascii="Times New Roman" w:hAnsi="Times New Roman" w:cs="Times New Roman"/>
+          <w:sz w:val="24"/>
+          <w:szCs w:val="24"/>
+        </w:rPr>
+      </w:pPr>
+      <w:r>
+        <w:rPr>
+          <w:rFonts w:ascii="Times New Roman" w:hAnsi="Times New Roman" w:cs="Times New Roman"/>
+          <w:sz w:val="24"/>
+          <w:szCs w:val="24"/>
+        </w:rPr>
+        <w:t xml:space="preserve">            </w:t>
+      </w:r>
+      <w:proofErr w:type="gramStart"/>
+      <w:r>
+        <w:rPr>
+          <w:rFonts w:ascii="Times New Roman" w:hAnsi="Times New Roman" w:cs="Times New Roman"/>
+          <w:sz w:val="24"/>
+          <w:szCs w:val="24"/>
+        </w:rPr>
+        <w:t>print(</w:t>
+      </w:r>
+      <w:proofErr w:type="gramEnd"/>
+      <w:r>
+        <w:rPr>
+          <w:rFonts w:ascii="Times New Roman" w:hAnsi="Times New Roman" w:cs="Times New Roman"/>
+          <w:sz w:val="24"/>
+          <w:szCs w:val="24"/>
+        </w:rPr>
+        <w:t>"\</w:t>
+      </w:r>
+      <w:proofErr w:type="spellStart"/>
+      <w:r>
+        <w:rPr>
+          <w:rFonts w:ascii="Times New Roman" w:hAnsi="Times New Roman" w:cs="Times New Roman"/>
+          <w:sz w:val="24"/>
+          <w:szCs w:val="24"/>
+        </w:rPr>
+        <w:t>nStudent</w:t>
+      </w:r>
+      <w:proofErr w:type="spellEnd"/>
+      <w:r>
+        <w:rPr>
+          <w:rFonts w:ascii="Times New Roman" w:hAnsi="Times New Roman" w:cs="Times New Roman"/>
+          <w:sz w:val="24"/>
+          <w:szCs w:val="24"/>
+        </w:rPr>
+        <w:t xml:space="preserve"> Grades:")</w:t>
+      </w:r>
+    </w:p>
+    <w:p>
+      <w:pPr>
+        <w:spacing w:after="0" w:line="240" w:lineRule="auto"/>
+        <w:rPr>
+          <w:rFonts w:ascii="Times New Roman" w:hAnsi="Times New Roman" w:cs="Times New Roman"/>
+          <w:sz w:val="24"/>
+          <w:szCs w:val="24"/>
+        </w:rPr>
+      </w:pPr>
+      <w:r>
+        <w:rPr>
+          <w:rFonts w:ascii="Times New Roman" w:hAnsi="Times New Roman" w:cs="Times New Roman"/>
+          <w:sz w:val="24"/>
+          <w:szCs w:val="24"/>
+        </w:rPr>
+        <w:t xml:space="preserve">            for name, grade in </w:t>
+      </w:r>
+      <w:proofErr w:type="spellStart"/>
+      <w:proofErr w:type="gramStart"/>
+      <w:r>
+        <w:rPr>
+          <w:rFonts w:ascii="Times New Roman" w:hAnsi="Times New Roman" w:cs="Times New Roman"/>
+          <w:sz w:val="24"/>
+          <w:szCs w:val="24"/>
+        </w:rPr>
+        <w:t>students.items</w:t>
+      </w:r>
+      <w:proofErr w:type="spellEnd"/>
+      <w:proofErr w:type="gramEnd"/>
+      <w:r>
+        <w:rPr>
+          <w:rFonts w:ascii="Times New Roman" w:hAnsi="Times New Roman" w:cs="Times New Roman"/>
+          <w:sz w:val="24"/>
+          <w:szCs w:val="24"/>
+        </w:rPr>
+        <w:t>():</w:t>
+      </w:r>
+    </w:p>
+    <w:p>
+      <w:pPr>
+        <w:spacing w:after="0" w:line="240" w:lineRule="auto"/>
+        <w:rPr>
+          <w:rFonts w:ascii="Times New Roman" w:hAnsi="Times New Roman" w:cs="Times New Roman"/>
+          <w:sz w:val="24"/>
+          <w:szCs w:val="24"/>
+        </w:rPr>
+      </w:pPr>
+      <w:r>
+        <w:rPr>
+          <w:rFonts w:ascii="Times New Roman" w:hAnsi="Times New Roman" w:cs="Times New Roman"/>
+          <w:sz w:val="24"/>
+          <w:szCs w:val="24"/>
+        </w:rPr>
+        <w:t xml:space="preserve">                </w:t>
+      </w:r>
+      <w:proofErr w:type="gramStart"/>
+      <w:r>
+        <w:rPr>
+          <w:rFonts w:ascii="Times New Roman" w:hAnsi="Times New Roman" w:cs="Times New Roman"/>
+          <w:sz w:val="24"/>
+          <w:szCs w:val="24"/>
+        </w:rPr>
+        <w:t>print(</w:t>
+      </w:r>
+      <w:proofErr w:type="gramEnd"/>
+      <w:r>
+        <w:rPr>
+          <w:rFonts w:ascii="Times New Roman" w:hAnsi="Times New Roman" w:cs="Times New Roman"/>
+          <w:sz w:val="24"/>
+          <w:szCs w:val="24"/>
+        </w:rPr>
+        <w:t>name, ":", grade)</w:t>
+      </w:r>
+    </w:p>
+    <w:p>
+      <w:pPr>
+        <w:spacing w:after="0" w:line="240" w:lineRule="auto"/>
+        <w:rPr>
+          <w:rFonts w:ascii="Times New Roman" w:hAnsi="Times New Roman" w:cs="Times New Roman"/>
+          <w:sz w:val="24"/>
+          <w:szCs w:val="24"/>
+        </w:rPr>
+      </w:pPr>
+      <w:r>
+        <w:rPr>
+          <w:rFonts w:ascii="Times New Roman" w:hAnsi="Times New Roman" w:cs="Times New Roman"/>
+          <w:sz w:val="24"/>
+          <w:szCs w:val="24"/>
+        </w:rPr>
+        <w:t>        else:</w:t>
+      </w:r>
+    </w:p>
+    <w:p>
+      <w:pPr>
+        <w:spacing w:after="0" w:line="240" w:lineRule="auto"/>
+        <w:rPr>
+          <w:rFonts w:ascii="Times New Roman" w:hAnsi="Times New Roman" w:cs="Times New Roman"/>
+          <w:sz w:val="24"/>
+          <w:szCs w:val="24"/>
+        </w:rPr>
+      </w:pPr>
+      <w:r>
+        <w:rPr>
+          <w:rFonts w:ascii="Times New Roman" w:hAnsi="Times New Roman" w:cs="Times New Roman"/>
+          <w:sz w:val="24"/>
+          <w:szCs w:val="24"/>
+        </w:rPr>
+        <w:t xml:space="preserve">            </w:t>
+      </w:r>
+      <w:proofErr w:type="gramStart"/>
+      <w:r>
+        <w:rPr>
+          <w:rFonts w:ascii="Times New Roman" w:hAnsi="Times New Roman" w:cs="Times New Roman"/>
+          <w:sz w:val="24"/>
+          <w:szCs w:val="24"/>
+        </w:rPr>
+        <w:t>print(</w:t>
+      </w:r>
+      <w:proofErr w:type="gramEnd"/>
+      <w:r>
+        <w:rPr>
+          <w:rFonts w:ascii="Times New Roman" w:hAnsi="Times New Roman" w:cs="Times New Roman"/>
+          <w:sz w:val="24"/>
+          <w:szCs w:val="24"/>
+        </w:rPr>
+        <w:t>"No students found.")</w:t>
+      </w:r>
+    </w:p>
+    <w:p>
+      <w:pPr>
+        <w:spacing w:after="0" w:line="240" w:lineRule="auto"/>
+        <w:rPr>
+          <w:rFonts w:ascii="Times New Roman" w:hAnsi="Times New Roman" w:cs="Times New Roman"/>
+          <w:sz w:val="24"/>
+          <w:szCs w:val="24"/>
+        </w:rPr>
+      </w:pPr>
+      <w:r>
+        <w:rPr>
+          <w:rFonts w:ascii="Times New Roman" w:hAnsi="Times New Roman" w:cs="Times New Roman"/>
+          <w:sz w:val="24"/>
+          <w:szCs w:val="24"/>
+        </w:rPr>
+        <w:t xml:space="preserve">    </w:t>
+      </w:r>
+      <w:proofErr w:type="spellStart"/>
+      <w:r>
+        <w:rPr>
+          <w:rFonts w:ascii="Times New Roman" w:hAnsi="Times New Roman" w:cs="Times New Roman"/>
+          <w:sz w:val="24"/>
+          <w:szCs w:val="24"/>
+        </w:rPr>
+        <w:t>elif</w:t>
+      </w:r>
+      <w:proofErr w:type="spellEnd"/>
+      <w:r>
+        <w:rPr>
+          <w:rFonts w:ascii="Times New Roman" w:hAnsi="Times New Roman" w:cs="Times New Roman"/>
+          <w:sz w:val="24"/>
+          <w:szCs w:val="24"/>
+        </w:rPr>
+        <w:t xml:space="preserve"> choice == "4":</w:t>
+      </w:r>
+    </w:p>
+    <w:p>
+      <w:pPr>
+        <w:spacing w:after="0" w:line="240" w:lineRule="auto"/>
+        <w:rPr>
+          <w:rFonts w:ascii="Times New Roman" w:hAnsi="Times New Roman" w:cs="Times New Roman"/>
+          <w:sz w:val="24"/>
+          <w:szCs w:val="24"/>
+        </w:rPr>
+      </w:pPr>
+      <w:r>
+        <w:rPr>
+          <w:rFonts w:ascii="Times New Roman" w:hAnsi="Times New Roman" w:cs="Times New Roman"/>
+          <w:sz w:val="24"/>
+          <w:szCs w:val="24"/>
+        </w:rPr>
+        <w:t xml:space="preserve">        </w:t>
+      </w:r>
+      <w:proofErr w:type="gramStart"/>
+      <w:r>
+        <w:rPr>
+          <w:rFonts w:ascii="Times New Roman" w:hAnsi="Times New Roman" w:cs="Times New Roman"/>
+          <w:sz w:val="24"/>
+          <w:szCs w:val="24"/>
+        </w:rPr>
+        <w:t>print(</w:t>
+      </w:r>
+      <w:proofErr w:type="gramEnd"/>
+      <w:r>
+        <w:rPr>
+          <w:rFonts w:ascii="Times New Roman" w:hAnsi="Times New Roman" w:cs="Times New Roman"/>
+          <w:sz w:val="24"/>
+          <w:szCs w:val="24"/>
+        </w:rPr>
+        <w:t>"Exiting program.")</w:t>
+      </w:r>
+    </w:p>
+    <w:p>
+      <w:pPr>
+        <w:spacing w:after="0" w:line="240" w:lineRule="auto"/>
+        <w:rPr>
+          <w:rFonts w:ascii="Times New Roman" w:hAnsi="Times New Roman" w:cs="Times New Roman"/>
+          <w:sz w:val="24"/>
+          <w:szCs w:val="24"/>
+        </w:rPr>
+      </w:pPr>
+      <w:r>
+        <w:rPr>
+          <w:rFonts w:ascii="Times New Roman" w:hAnsi="Times New Roman" w:cs="Times New Roman"/>
+          <w:sz w:val="24"/>
+          <w:szCs w:val="24"/>
+        </w:rPr>
+        <w:t>        break</w:t>
+      </w:r>
+    </w:p>
+    <w:p>
+      <w:pPr>
+        <w:spacing w:after="0" w:line="240" w:lineRule="auto"/>
+        <w:rPr>
+          <w:rFonts w:ascii="Times New Roman" w:hAnsi="Times New Roman" w:cs="Times New Roman"/>
+          <w:sz w:val="24"/>
+          <w:szCs w:val="24"/>
+        </w:rPr>
+      </w:pPr>
+      <w:r>
+        <w:rPr>
+          <w:rFonts w:ascii="Times New Roman" w:hAnsi="Times New Roman" w:cs="Times New Roman"/>
+          <w:sz w:val="24"/>
+          <w:szCs w:val="24"/>
+        </w:rPr>
+        <w:t>    else:</w:t>
+      </w:r>
+    </w:p>
+    <w:p>
+      <w:pPr>
+        <w:spacing w:after="0" w:line="240" w:lineRule="auto"/>
+        <w:rPr>
+          <w:rFonts w:ascii="Times New Roman" w:hAnsi="Times New Roman" w:cs="Times New Roman"/>
+          <w:sz w:val="24"/>
+          <w:szCs w:val="24"/>
+        </w:rPr>
+      </w:pPr>
+      <w:r>
+        <w:rPr>
+          <w:rFonts w:ascii="Times New Roman" w:hAnsi="Times New Roman" w:cs="Times New Roman"/>
+          <w:sz w:val="24"/>
+          <w:szCs w:val="24"/>
+        </w:rPr>
+        <w:t xml:space="preserve">        </w:t>
+      </w:r>
+      <w:proofErr w:type="gramStart"/>
+      <w:r>
+        <w:rPr>
+          <w:rFonts w:ascii="Times New Roman" w:hAnsi="Times New Roman" w:cs="Times New Roman"/>
+          <w:sz w:val="24"/>
+          <w:szCs w:val="24"/>
+        </w:rPr>
+        <w:t>print(</w:t>
+      </w:r>
+      <w:proofErr w:type="gramEnd"/>
+      <w:r>
+        <w:rPr>
+          <w:rFonts w:ascii="Times New Roman" w:hAnsi="Times New Roman" w:cs="Times New Roman"/>
+          <w:sz w:val="24"/>
+          <w:szCs w:val="24"/>
+        </w:rPr>
+        <w:t>"Invalid choice. Try again.")</w:t>
       </w:r>
     </w:p>
     <w:p>
@@ -791,16 +1798,6 @@
           <w:szCs w:val="24"/>
         </w:rPr>
       </w:pPr>
-      <w:r>
-        <w:rPr>
-          <w:rFonts w:ascii="Times New Roman" w:hAnsi="Times New Roman" w:cs="Times New Roman"/>
-          <w:b/>
-          <w:bCs/>
-          <w:sz w:val="24"/>
-          <w:szCs w:val="24"/>
-        </w:rPr>
-        <w:t>Print all student grades.</w:t>
-      </w:r>
     </w:p>
     <w:p>
       <w:pPr>
@@ -821,6 +1818,72 @@
           <w:sz w:val="24"/>
           <w:szCs w:val="24"/>
         </w:rPr>
+        <w:t>Used dictionary and basic operations. Using if else:</w:t>
+      </w:r>
+    </w:p>
+    <w:p>
+      <w:pPr>
+        <w:spacing w:after="0" w:line="360" w:lineRule="auto"/>
+        <w:rPr>
+          <w:rFonts w:ascii="Times New Roman" w:hAnsi="Times New Roman" w:cs="Times New Roman"/>
+          <w:b/>
+          <w:bCs/>
+          <w:sz w:val="24"/>
+          <w:szCs w:val="24"/>
+        </w:rPr>
+      </w:pPr>
+      <w:r>
+        <w:rPr>
+          <w:rFonts w:ascii="Times New Roman" w:hAnsi="Times New Roman" w:cs="Times New Roman"/>
+          <w:b/>
+          <w:bCs/>
+          <w:sz w:val="24"/>
+          <w:szCs w:val="24"/>
+        </w:rPr>
+        <w:t>3.Write to a File</w:t>
+      </w:r>
+    </w:p>
+    <w:p>
+      <w:pPr>
+        <w:spacing w:after="0" w:line="360" w:lineRule="auto"/>
+        <w:rPr>
+          <w:rFonts w:ascii="Times New Roman" w:hAnsi="Times New Roman" w:cs="Times New Roman"/>
+          <w:b/>
+          <w:bCs/>
+          <w:sz w:val="24"/>
+          <w:szCs w:val="24"/>
+        </w:rPr>
+      </w:pPr>
+      <w:r>
+        <w:rPr>
+          <w:rFonts w:ascii="Times New Roman" w:hAnsi="Times New Roman" w:cs="Times New Roman"/>
+          <w:b/>
+          <w:bCs/>
+          <w:sz w:val="24"/>
+          <w:szCs w:val="24"/>
+        </w:rPr>
+        <w:t>Write a program to create a text file and write some content to it.</w:t>
+      </w:r>
+    </w:p>
+    <w:p>
+      <w:pPr>
+        <w:spacing w:after="0" w:line="360" w:lineRule="auto"/>
+        <w:rPr>
+          <w:rFonts w:ascii="Times New Roman" w:hAnsi="Times New Roman" w:cs="Times New Roman"/>
+          <w:b/>
+          <w:bCs/>
+          <w:sz w:val="24"/>
+          <w:szCs w:val="24"/>
+        </w:rPr>
+      </w:pPr>
+      <w:r>
+        <w:rPr>
+          <w:rFonts w:ascii="Times New Roman" w:hAnsi="Times New Roman" w:cs="Times New Roman"/>
+          <w:b/>
+          <w:bCs/>
+          <w:sz w:val="24"/>
+          <w:szCs w:val="24"/>
+        </w:rPr>
         <w:t>Ans:</w:t>
       </w:r>
     </w:p>
@@ -839,44 +1902,126 @@
           <w:sz w:val="24"/>
           <w:szCs w:val="24"/>
         </w:rPr>
-        <w:t>students = {}</w:t>
-      </w:r>
-    </w:p>
-    <w:p>
-      <w:pPr>
-        <w:spacing w:after="0" w:line="240" w:lineRule="auto"/>
-        <w:rPr>
-          <w:rFonts w:ascii="Times New Roman" w:hAnsi="Times New Roman" w:cs="Times New Roman"/>
-          <w:sz w:val="24"/>
-          <w:szCs w:val="24"/>
-        </w:rPr>
-      </w:pPr>
-      <w:r>
-        <w:rPr>
-          <w:rFonts w:ascii="Times New Roman" w:hAnsi="Times New Roman" w:cs="Times New Roman"/>
-          <w:sz w:val="24"/>
-          <w:szCs w:val="24"/>
-        </w:rPr>
-        <w:t>while True:</w:t>
-      </w:r>
-    </w:p>
-    <w:p>
-      <w:pPr>
-        <w:spacing w:after="0" w:line="240" w:lineRule="auto"/>
-        <w:rPr>
-          <w:rFonts w:ascii="Times New Roman" w:hAnsi="Times New Roman" w:cs="Times New Roman"/>
-          <w:sz w:val="24"/>
-          <w:szCs w:val="24"/>
-        </w:rPr>
-      </w:pPr>
-      <w:r>
-        <w:rPr>
-          <w:rFonts w:ascii="Times New Roman" w:hAnsi="Times New Roman" w:cs="Times New Roman"/>
-          <w:sz w:val="24"/>
-          <w:szCs w:val="24"/>
-        </w:rPr>
-        <w:t xml:space="preserve">    </w:t>
-      </w:r>
+        <w:t xml:space="preserve">file = </w:t>
+      </w:r>
+      <w:proofErr w:type="gramStart"/>
+      <w:r>
+        <w:rPr>
+          <w:rFonts w:ascii="Times New Roman" w:hAnsi="Times New Roman" w:cs="Times New Roman"/>
+          <w:sz w:val="24"/>
+          <w:szCs w:val="24"/>
+        </w:rPr>
+        <w:t>open(</w:t>
+      </w:r>
+      <w:proofErr w:type="gramEnd"/>
+      <w:r>
+        <w:rPr>
+          <w:rFonts w:ascii="Times New Roman" w:hAnsi="Times New Roman" w:cs="Times New Roman"/>
+          <w:sz w:val="24"/>
+          <w:szCs w:val="24"/>
+        </w:rPr>
+        <w:t>"sample.txt", "w")</w:t>
+      </w:r>
+    </w:p>
+    <w:p>
+      <w:pPr>
+        <w:spacing w:after="0" w:line="240" w:lineRule="auto"/>
+        <w:rPr>
+          <w:rFonts w:ascii="Times New Roman" w:hAnsi="Times New Roman" w:cs="Times New Roman"/>
+          <w:sz w:val="24"/>
+          <w:szCs w:val="24"/>
+        </w:rPr>
+      </w:pPr>
+      <w:proofErr w:type="spellStart"/>
+      <w:proofErr w:type="gramStart"/>
+      <w:r>
+        <w:rPr>
+          <w:rFonts w:ascii="Times New Roman" w:hAnsi="Times New Roman" w:cs="Times New Roman"/>
+          <w:sz w:val="24"/>
+          <w:szCs w:val="24"/>
+        </w:rPr>
+        <w:t>file.write</w:t>
+      </w:r>
+      <w:proofErr w:type="spellEnd"/>
+      <w:proofErr w:type="gramEnd"/>
+      <w:r>
+        <w:rPr>
+          <w:rFonts w:ascii="Times New Roman" w:hAnsi="Times New Roman" w:cs="Times New Roman"/>
+          <w:sz w:val="24"/>
+          <w:szCs w:val="24"/>
+        </w:rPr>
+        <w:t>("Hello, this is a sample text file.\n")</w:t>
+      </w:r>
+    </w:p>
+    <w:p>
+      <w:pPr>
+        <w:spacing w:after="0" w:line="240" w:lineRule="auto"/>
+        <w:rPr>
+          <w:rFonts w:ascii="Times New Roman" w:hAnsi="Times New Roman" w:cs="Times New Roman"/>
+          <w:sz w:val="24"/>
+          <w:szCs w:val="24"/>
+        </w:rPr>
+      </w:pPr>
+      <w:proofErr w:type="spellStart"/>
+      <w:proofErr w:type="gramStart"/>
+      <w:r>
+        <w:rPr>
+          <w:rFonts w:ascii="Times New Roman" w:hAnsi="Times New Roman" w:cs="Times New Roman"/>
+          <w:sz w:val="24"/>
+          <w:szCs w:val="24"/>
+        </w:rPr>
+        <w:t>file.write</w:t>
+      </w:r>
+      <w:proofErr w:type="spellEnd"/>
+      <w:proofErr w:type="gramEnd"/>
+      <w:r>
+        <w:rPr>
+          <w:rFonts w:ascii="Times New Roman" w:hAnsi="Times New Roman" w:cs="Times New Roman"/>
+          <w:sz w:val="24"/>
+          <w:szCs w:val="24"/>
+        </w:rPr>
+        <w:t>("This content is written using Python.\n")</w:t>
+      </w:r>
+    </w:p>
+    <w:p>
+      <w:pPr>
+        <w:spacing w:after="0" w:line="240" w:lineRule="auto"/>
+        <w:rPr>
+          <w:rFonts w:ascii="Times New Roman" w:hAnsi="Times New Roman" w:cs="Times New Roman"/>
+          <w:sz w:val="24"/>
+          <w:szCs w:val="24"/>
+        </w:rPr>
+      </w:pPr>
+      <w:proofErr w:type="spellStart"/>
+      <w:proofErr w:type="gramStart"/>
+      <w:r>
+        <w:rPr>
+          <w:rFonts w:ascii="Times New Roman" w:hAnsi="Times New Roman" w:cs="Times New Roman"/>
+          <w:sz w:val="24"/>
+          <w:szCs w:val="24"/>
+        </w:rPr>
+        <w:t>file.close</w:t>
+      </w:r>
+      <w:proofErr w:type="spellEnd"/>
+      <w:proofErr w:type="gramEnd"/>
+      <w:r>
+        <w:rPr>
+          <w:rFonts w:ascii="Times New Roman" w:hAnsi="Times New Roman" w:cs="Times New Roman"/>
+          <w:sz w:val="24"/>
+          <w:szCs w:val="24"/>
+        </w:rPr>
+        <w:t>()</w:t>
+      </w:r>
+    </w:p>
+    <w:p>
+      <w:pPr>
+        <w:spacing w:after="0" w:line="240" w:lineRule="auto"/>
+        <w:rPr>
+          <w:rFonts w:ascii="Times New Roman" w:hAnsi="Times New Roman" w:cs="Times New Roman"/>
+          <w:sz w:val="24"/>
+          <w:szCs w:val="24"/>
+        </w:rPr>
+      </w:pPr>
       <w:proofErr w:type="gramStart"/>
       <w:r>
         <w:rPr>
@@ -893,1205 +2038,8 @@
           <w:sz w:val="24"/>
           <w:szCs w:val="24"/>
         </w:rPr>
-        <w:t>"\n1. Add Student")</w:t>
-      </w:r>
-    </w:p>
-    <w:p>
-      <w:pPr>
-        <w:spacing w:after="0" w:line="240" w:lineRule="auto"/>
-        <w:rPr>
-          <w:rFonts w:ascii="Times New Roman" w:hAnsi="Times New Roman" w:cs="Times New Roman"/>
-          <w:sz w:val="24"/>
-          <w:szCs w:val="24"/>
-        </w:rPr>
-      </w:pPr>
-      <w:r>
-        <w:rPr>
-          <w:rFonts w:ascii="Times New Roman" w:hAnsi="Times New Roman" w:cs="Times New Roman"/>
-          <w:sz w:val="24"/>
-          <w:szCs w:val="24"/>
-        </w:rPr>
-        <w:t xml:space="preserve">    </w:t>
-      </w:r>
-      <w:proofErr w:type="gramStart"/>
-      <w:r>
-        <w:rPr>
-          <w:rFonts w:ascii="Times New Roman" w:hAnsi="Times New Roman" w:cs="Times New Roman"/>
-          <w:sz w:val="24"/>
-          <w:szCs w:val="24"/>
-        </w:rPr>
-        <w:t>print(</w:t>
-      </w:r>
-      <w:proofErr w:type="gramEnd"/>
-      <w:r>
-        <w:rPr>
-          <w:rFonts w:ascii="Times New Roman" w:hAnsi="Times New Roman" w:cs="Times New Roman"/>
-          <w:sz w:val="24"/>
-          <w:szCs w:val="24"/>
-        </w:rPr>
-        <w:t>"2. Update Student Grade")</w:t>
-      </w:r>
-    </w:p>
-    <w:p>
-      <w:pPr>
-        <w:spacing w:after="0" w:line="240" w:lineRule="auto"/>
-        <w:rPr>
-          <w:rFonts w:ascii="Times New Roman" w:hAnsi="Times New Roman" w:cs="Times New Roman"/>
-          <w:sz w:val="24"/>
-          <w:szCs w:val="24"/>
-        </w:rPr>
-      </w:pPr>
-      <w:r>
-        <w:rPr>
-          <w:rFonts w:ascii="Times New Roman" w:hAnsi="Times New Roman" w:cs="Times New Roman"/>
-          <w:sz w:val="24"/>
-          <w:szCs w:val="24"/>
-        </w:rPr>
-        <w:t xml:space="preserve">    </w:t>
-      </w:r>
-      <w:proofErr w:type="gramStart"/>
-      <w:r>
-        <w:rPr>
-          <w:rFonts w:ascii="Times New Roman" w:hAnsi="Times New Roman" w:cs="Times New Roman"/>
-          <w:sz w:val="24"/>
-          <w:szCs w:val="24"/>
-        </w:rPr>
-        <w:t>print(</w:t>
-      </w:r>
-      <w:proofErr w:type="gramEnd"/>
-      <w:r>
-        <w:rPr>
-          <w:rFonts w:ascii="Times New Roman" w:hAnsi="Times New Roman" w:cs="Times New Roman"/>
-          <w:sz w:val="24"/>
-          <w:szCs w:val="24"/>
-        </w:rPr>
-        <w:t>"3. Print All Students")</w:t>
-      </w:r>
-    </w:p>
-    <w:p>
-      <w:pPr>
-        <w:spacing w:after="0" w:line="240" w:lineRule="auto"/>
-        <w:rPr>
-          <w:rFonts w:ascii="Times New Roman" w:hAnsi="Times New Roman" w:cs="Times New Roman"/>
-          <w:sz w:val="24"/>
-          <w:szCs w:val="24"/>
-        </w:rPr>
-      </w:pPr>
-      <w:r>
-        <w:rPr>
-          <w:rFonts w:ascii="Times New Roman" w:hAnsi="Times New Roman" w:cs="Times New Roman"/>
-          <w:sz w:val="24"/>
-          <w:szCs w:val="24"/>
-        </w:rPr>
-        <w:t xml:space="preserve">    </w:t>
-      </w:r>
-      <w:proofErr w:type="gramStart"/>
-      <w:r>
-        <w:rPr>
-          <w:rFonts w:ascii="Times New Roman" w:hAnsi="Times New Roman" w:cs="Times New Roman"/>
-          <w:sz w:val="24"/>
-          <w:szCs w:val="24"/>
-        </w:rPr>
-        <w:t>print(</w:t>
-      </w:r>
-      <w:proofErr w:type="gramEnd"/>
-      <w:r>
-        <w:rPr>
-          <w:rFonts w:ascii="Times New Roman" w:hAnsi="Times New Roman" w:cs="Times New Roman"/>
-          <w:sz w:val="24"/>
-          <w:szCs w:val="24"/>
-        </w:rPr>
-        <w:t>"4. Exit")</w:t>
-      </w:r>
-    </w:p>
-    <w:p>
-      <w:pPr>
-        <w:spacing w:after="0" w:line="240" w:lineRule="auto"/>
-        <w:rPr>
-          <w:rFonts w:ascii="Times New Roman" w:hAnsi="Times New Roman" w:cs="Times New Roman"/>
-          <w:sz w:val="24"/>
-          <w:szCs w:val="24"/>
-        </w:rPr>
-      </w:pPr>
-    </w:p>
-    <w:p>
-      <w:pPr>
-        <w:spacing w:after="0" w:line="240" w:lineRule="auto"/>
-        <w:rPr>
-          <w:rFonts w:ascii="Times New Roman" w:hAnsi="Times New Roman" w:cs="Times New Roman"/>
-          <w:sz w:val="24"/>
-          <w:szCs w:val="24"/>
-        </w:rPr>
-      </w:pPr>
-      <w:r>
-        <w:rPr>
-          <w:rFonts w:ascii="Times New Roman" w:hAnsi="Times New Roman" w:cs="Times New Roman"/>
-          <w:sz w:val="24"/>
-          <w:szCs w:val="24"/>
-        </w:rPr>
-        <w:t xml:space="preserve">    choice = </w:t>
-      </w:r>
-      <w:proofErr w:type="gramStart"/>
-      <w:r>
-        <w:rPr>
-          <w:rFonts w:ascii="Times New Roman" w:hAnsi="Times New Roman" w:cs="Times New Roman"/>
-          <w:sz w:val="24"/>
-          <w:szCs w:val="24"/>
-        </w:rPr>
-        <w:t>input(</w:t>
-      </w:r>
-      <w:proofErr w:type="gramEnd"/>
-      <w:r>
-        <w:rPr>
-          <w:rFonts w:ascii="Times New Roman" w:hAnsi="Times New Roman" w:cs="Times New Roman"/>
-          <w:sz w:val="24"/>
-          <w:szCs w:val="24"/>
-        </w:rPr>
-        <w:t>"Enter your choice: ")</w:t>
-      </w:r>
-    </w:p>
-    <w:p>
-      <w:pPr>
-        <w:spacing w:after="0" w:line="240" w:lineRule="auto"/>
-        <w:rPr>
-          <w:rFonts w:ascii="Times New Roman" w:hAnsi="Times New Roman" w:cs="Times New Roman"/>
-          <w:sz w:val="24"/>
-          <w:szCs w:val="24"/>
-        </w:rPr>
-      </w:pPr>
-      <w:r>
-        <w:rPr>
-          <w:rFonts w:ascii="Times New Roman" w:hAnsi="Times New Roman" w:cs="Times New Roman"/>
-          <w:sz w:val="24"/>
-          <w:szCs w:val="24"/>
-        </w:rPr>
-        <w:t>    if choice == "1":</w:t>
-      </w:r>
-    </w:p>
-    <w:p>
-      <w:pPr>
-        <w:spacing w:after="0" w:line="240" w:lineRule="auto"/>
-        <w:rPr>
-          <w:rFonts w:ascii="Times New Roman" w:hAnsi="Times New Roman" w:cs="Times New Roman"/>
-          <w:sz w:val="24"/>
-          <w:szCs w:val="24"/>
-        </w:rPr>
-      </w:pPr>
-      <w:r>
-        <w:rPr>
-          <w:rFonts w:ascii="Times New Roman" w:hAnsi="Times New Roman" w:cs="Times New Roman"/>
-          <w:sz w:val="24"/>
-          <w:szCs w:val="24"/>
-        </w:rPr>
-        <w:t xml:space="preserve">        name = </w:t>
-      </w:r>
-      <w:proofErr w:type="gramStart"/>
-      <w:r>
-        <w:rPr>
-          <w:rFonts w:ascii="Times New Roman" w:hAnsi="Times New Roman" w:cs="Times New Roman"/>
-          <w:sz w:val="24"/>
-          <w:szCs w:val="24"/>
-        </w:rPr>
-        <w:t>input(</w:t>
-      </w:r>
-      <w:proofErr w:type="gramEnd"/>
-      <w:r>
-        <w:rPr>
-          <w:rFonts w:ascii="Times New Roman" w:hAnsi="Times New Roman" w:cs="Times New Roman"/>
-          <w:sz w:val="24"/>
-          <w:szCs w:val="24"/>
-        </w:rPr>
-        <w:t>"Enter student name: ")</w:t>
-      </w:r>
-    </w:p>
-    <w:p>
-      <w:pPr>
-        <w:spacing w:after="0" w:line="240" w:lineRule="auto"/>
-        <w:rPr>
-          <w:rFonts w:ascii="Times New Roman" w:hAnsi="Times New Roman" w:cs="Times New Roman"/>
-          <w:sz w:val="24"/>
-          <w:szCs w:val="24"/>
-        </w:rPr>
-      </w:pPr>
-      <w:r>
-        <w:rPr>
-          <w:rFonts w:ascii="Times New Roman" w:hAnsi="Times New Roman" w:cs="Times New Roman"/>
-          <w:sz w:val="24"/>
-          <w:szCs w:val="24"/>
-        </w:rPr>
-        <w:t xml:space="preserve">        grade = </w:t>
-      </w:r>
-      <w:proofErr w:type="gramStart"/>
-      <w:r>
-        <w:rPr>
-          <w:rFonts w:ascii="Times New Roman" w:hAnsi="Times New Roman" w:cs="Times New Roman"/>
-          <w:sz w:val="24"/>
-          <w:szCs w:val="24"/>
-        </w:rPr>
-        <w:t>input(</w:t>
-      </w:r>
-      <w:proofErr w:type="gramEnd"/>
-      <w:r>
-        <w:rPr>
-          <w:rFonts w:ascii="Times New Roman" w:hAnsi="Times New Roman" w:cs="Times New Roman"/>
-          <w:sz w:val="24"/>
-          <w:szCs w:val="24"/>
-        </w:rPr>
-        <w:t>"Enter grade: ")</w:t>
-      </w:r>
-    </w:p>
-    <w:p>
-      <w:pPr>
-        <w:spacing w:after="0" w:line="240" w:lineRule="auto"/>
-        <w:rPr>
-          <w:rFonts w:ascii="Times New Roman" w:hAnsi="Times New Roman" w:cs="Times New Roman"/>
-          <w:sz w:val="24"/>
-          <w:szCs w:val="24"/>
-        </w:rPr>
-      </w:pPr>
-      <w:r>
-        <w:rPr>
-          <w:rFonts w:ascii="Times New Roman" w:hAnsi="Times New Roman" w:cs="Times New Roman"/>
-          <w:sz w:val="24"/>
-          <w:szCs w:val="24"/>
-        </w:rPr>
-        <w:t>        students[name] = grade</w:t>
-      </w:r>
-    </w:p>
-    <w:p>
-      <w:pPr>
-        <w:spacing w:after="0" w:line="240" w:lineRule="auto"/>
-        <w:rPr>
-          <w:rFonts w:ascii="Times New Roman" w:hAnsi="Times New Roman" w:cs="Times New Roman"/>
-          <w:sz w:val="24"/>
-          <w:szCs w:val="24"/>
-        </w:rPr>
-      </w:pPr>
-      <w:r>
-        <w:rPr>
-          <w:rFonts w:ascii="Times New Roman" w:hAnsi="Times New Roman" w:cs="Times New Roman"/>
-          <w:sz w:val="24"/>
-          <w:szCs w:val="24"/>
-        </w:rPr>
-        <w:t xml:space="preserve">        </w:t>
-      </w:r>
-      <w:proofErr w:type="gramStart"/>
-      <w:r>
-        <w:rPr>
-          <w:rFonts w:ascii="Times New Roman" w:hAnsi="Times New Roman" w:cs="Times New Roman"/>
-          <w:sz w:val="24"/>
-          <w:szCs w:val="24"/>
-        </w:rPr>
-        <w:t>print(</w:t>
-      </w:r>
-      <w:proofErr w:type="gramEnd"/>
-      <w:r>
-        <w:rPr>
-          <w:rFonts w:ascii="Times New Roman" w:hAnsi="Times New Roman" w:cs="Times New Roman"/>
-          <w:sz w:val="24"/>
-          <w:szCs w:val="24"/>
-        </w:rPr>
-        <w:t>"Student added successfully.")</w:t>
-      </w:r>
-    </w:p>
-    <w:p>
-      <w:pPr>
-        <w:spacing w:after="0" w:line="240" w:lineRule="auto"/>
-        <w:rPr>
-          <w:rFonts w:ascii="Times New Roman" w:hAnsi="Times New Roman" w:cs="Times New Roman"/>
-          <w:sz w:val="24"/>
-          <w:szCs w:val="24"/>
-        </w:rPr>
-      </w:pPr>
-      <w:r>
-        <w:rPr>
-          <w:rFonts w:ascii="Times New Roman" w:hAnsi="Times New Roman" w:cs="Times New Roman"/>
-          <w:sz w:val="24"/>
-          <w:szCs w:val="24"/>
-        </w:rPr>
-        <w:t xml:space="preserve">    </w:t>
-      </w:r>
-      <w:proofErr w:type="spellStart"/>
-      <w:r>
-        <w:rPr>
-          <w:rFonts w:ascii="Times New Roman" w:hAnsi="Times New Roman" w:cs="Times New Roman"/>
-          <w:sz w:val="24"/>
-          <w:szCs w:val="24"/>
-        </w:rPr>
-        <w:t>elif</w:t>
-      </w:r>
-      <w:proofErr w:type="spellEnd"/>
-      <w:r>
-        <w:rPr>
-          <w:rFonts w:ascii="Times New Roman" w:hAnsi="Times New Roman" w:cs="Times New Roman"/>
-          <w:sz w:val="24"/>
-          <w:szCs w:val="24"/>
-        </w:rPr>
-        <w:t xml:space="preserve"> choice == "2":</w:t>
-      </w:r>
-    </w:p>
-    <w:p>
-      <w:pPr>
-        <w:spacing w:after="0" w:line="240" w:lineRule="auto"/>
-        <w:rPr>
-          <w:rFonts w:ascii="Times New Roman" w:hAnsi="Times New Roman" w:cs="Times New Roman"/>
-          <w:sz w:val="24"/>
-          <w:szCs w:val="24"/>
-        </w:rPr>
-      </w:pPr>
-      <w:r>
-        <w:rPr>
-          <w:rFonts w:ascii="Times New Roman" w:hAnsi="Times New Roman" w:cs="Times New Roman"/>
-          <w:sz w:val="24"/>
-          <w:szCs w:val="24"/>
-        </w:rPr>
-        <w:lastRenderedPageBreak/>
-        <w:t xml:space="preserve">        name = </w:t>
-      </w:r>
-      <w:proofErr w:type="gramStart"/>
-      <w:r>
-        <w:rPr>
-          <w:rFonts w:ascii="Times New Roman" w:hAnsi="Times New Roman" w:cs="Times New Roman"/>
-          <w:sz w:val="24"/>
-          <w:szCs w:val="24"/>
-        </w:rPr>
-        <w:t>input(</w:t>
-      </w:r>
-      <w:proofErr w:type="gramEnd"/>
-      <w:r>
-        <w:rPr>
-          <w:rFonts w:ascii="Times New Roman" w:hAnsi="Times New Roman" w:cs="Times New Roman"/>
-          <w:sz w:val="24"/>
-          <w:szCs w:val="24"/>
-        </w:rPr>
-        <w:t>"Enter student name to update: ")</w:t>
-      </w:r>
-    </w:p>
-    <w:p>
-      <w:pPr>
-        <w:spacing w:after="0" w:line="240" w:lineRule="auto"/>
-        <w:rPr>
-          <w:rFonts w:ascii="Times New Roman" w:hAnsi="Times New Roman" w:cs="Times New Roman"/>
-          <w:sz w:val="24"/>
-          <w:szCs w:val="24"/>
-        </w:rPr>
-      </w:pPr>
-      <w:r>
-        <w:rPr>
-          <w:rFonts w:ascii="Times New Roman" w:hAnsi="Times New Roman" w:cs="Times New Roman"/>
-          <w:sz w:val="24"/>
-          <w:szCs w:val="24"/>
-        </w:rPr>
-        <w:t>        if name in students:</w:t>
-      </w:r>
-    </w:p>
-    <w:p>
-      <w:pPr>
-        <w:spacing w:after="0" w:line="240" w:lineRule="auto"/>
-        <w:rPr>
-          <w:rFonts w:ascii="Times New Roman" w:hAnsi="Times New Roman" w:cs="Times New Roman"/>
-          <w:sz w:val="24"/>
-          <w:szCs w:val="24"/>
-        </w:rPr>
-      </w:pPr>
-      <w:r>
-        <w:rPr>
-          <w:rFonts w:ascii="Times New Roman" w:hAnsi="Times New Roman" w:cs="Times New Roman"/>
-          <w:sz w:val="24"/>
-          <w:szCs w:val="24"/>
-        </w:rPr>
-        <w:t xml:space="preserve">            grade = </w:t>
-      </w:r>
-      <w:proofErr w:type="gramStart"/>
-      <w:r>
-        <w:rPr>
-          <w:rFonts w:ascii="Times New Roman" w:hAnsi="Times New Roman" w:cs="Times New Roman"/>
-          <w:sz w:val="24"/>
-          <w:szCs w:val="24"/>
-        </w:rPr>
-        <w:t>input(</w:t>
-      </w:r>
-      <w:proofErr w:type="gramEnd"/>
-      <w:r>
-        <w:rPr>
-          <w:rFonts w:ascii="Times New Roman" w:hAnsi="Times New Roman" w:cs="Times New Roman"/>
-          <w:sz w:val="24"/>
-          <w:szCs w:val="24"/>
-        </w:rPr>
-        <w:t>"Enter new grade: ")</w:t>
-      </w:r>
-    </w:p>
-    <w:p>
-      <w:pPr>
-        <w:spacing w:after="0" w:line="240" w:lineRule="auto"/>
-        <w:rPr>
-          <w:rFonts w:ascii="Times New Roman" w:hAnsi="Times New Roman" w:cs="Times New Roman"/>
-          <w:sz w:val="24"/>
-          <w:szCs w:val="24"/>
-        </w:rPr>
-      </w:pPr>
-      <w:r>
-        <w:rPr>
-          <w:rFonts w:ascii="Times New Roman" w:hAnsi="Times New Roman" w:cs="Times New Roman"/>
-          <w:sz w:val="24"/>
-          <w:szCs w:val="24"/>
-        </w:rPr>
-        <w:t>            students[name] = grade</w:t>
-      </w:r>
-    </w:p>
-    <w:p>
-      <w:pPr>
-        <w:spacing w:after="0" w:line="240" w:lineRule="auto"/>
-        <w:rPr>
-          <w:rFonts w:ascii="Times New Roman" w:hAnsi="Times New Roman" w:cs="Times New Roman"/>
-          <w:sz w:val="24"/>
-          <w:szCs w:val="24"/>
-        </w:rPr>
-      </w:pPr>
-      <w:r>
-        <w:rPr>
-          <w:rFonts w:ascii="Times New Roman" w:hAnsi="Times New Roman" w:cs="Times New Roman"/>
-          <w:sz w:val="24"/>
-          <w:szCs w:val="24"/>
-        </w:rPr>
-        <w:t xml:space="preserve">            </w:t>
-      </w:r>
-      <w:proofErr w:type="gramStart"/>
-      <w:r>
-        <w:rPr>
-          <w:rFonts w:ascii="Times New Roman" w:hAnsi="Times New Roman" w:cs="Times New Roman"/>
-          <w:sz w:val="24"/>
-          <w:szCs w:val="24"/>
-        </w:rPr>
-        <w:t>print(</w:t>
-      </w:r>
-      <w:proofErr w:type="gramEnd"/>
-      <w:r>
-        <w:rPr>
-          <w:rFonts w:ascii="Times New Roman" w:hAnsi="Times New Roman" w:cs="Times New Roman"/>
-          <w:sz w:val="24"/>
-          <w:szCs w:val="24"/>
-        </w:rPr>
-        <w:t>"Grade updated successfully.")</w:t>
-      </w:r>
-    </w:p>
-    <w:p>
-      <w:pPr>
-        <w:spacing w:after="0" w:line="240" w:lineRule="auto"/>
-        <w:rPr>
-          <w:rFonts w:ascii="Times New Roman" w:hAnsi="Times New Roman" w:cs="Times New Roman"/>
-          <w:sz w:val="24"/>
-          <w:szCs w:val="24"/>
-        </w:rPr>
-      </w:pPr>
-      <w:r>
-        <w:rPr>
-          <w:rFonts w:ascii="Times New Roman" w:hAnsi="Times New Roman" w:cs="Times New Roman"/>
-          <w:sz w:val="24"/>
-          <w:szCs w:val="24"/>
-        </w:rPr>
-        <w:t>        else:</w:t>
-      </w:r>
-    </w:p>
-    <w:p>
-      <w:pPr>
-        <w:spacing w:after="0" w:line="240" w:lineRule="auto"/>
-        <w:rPr>
-          <w:rFonts w:ascii="Times New Roman" w:hAnsi="Times New Roman" w:cs="Times New Roman"/>
-          <w:sz w:val="24"/>
-          <w:szCs w:val="24"/>
-        </w:rPr>
-      </w:pPr>
-      <w:r>
-        <w:rPr>
-          <w:rFonts w:ascii="Times New Roman" w:hAnsi="Times New Roman" w:cs="Times New Roman"/>
-          <w:sz w:val="24"/>
-          <w:szCs w:val="24"/>
-        </w:rPr>
-        <w:t xml:space="preserve">            </w:t>
-      </w:r>
-      <w:proofErr w:type="gramStart"/>
-      <w:r>
-        <w:rPr>
-          <w:rFonts w:ascii="Times New Roman" w:hAnsi="Times New Roman" w:cs="Times New Roman"/>
-          <w:sz w:val="24"/>
-          <w:szCs w:val="24"/>
-        </w:rPr>
-        <w:t>print(</w:t>
-      </w:r>
-      <w:proofErr w:type="gramEnd"/>
-      <w:r>
-        <w:rPr>
-          <w:rFonts w:ascii="Times New Roman" w:hAnsi="Times New Roman" w:cs="Times New Roman"/>
-          <w:sz w:val="24"/>
-          <w:szCs w:val="24"/>
-        </w:rPr>
-        <w:t>"Student not found.")</w:t>
-      </w:r>
-    </w:p>
-    <w:p>
-      <w:pPr>
-        <w:spacing w:after="0" w:line="240" w:lineRule="auto"/>
-        <w:rPr>
-          <w:rFonts w:ascii="Times New Roman" w:hAnsi="Times New Roman" w:cs="Times New Roman"/>
-          <w:sz w:val="24"/>
-          <w:szCs w:val="24"/>
-        </w:rPr>
-      </w:pPr>
-      <w:r>
-        <w:rPr>
-          <w:rFonts w:ascii="Times New Roman" w:hAnsi="Times New Roman" w:cs="Times New Roman"/>
-          <w:sz w:val="24"/>
-          <w:szCs w:val="24"/>
-        </w:rPr>
-        <w:t xml:space="preserve">    </w:t>
-      </w:r>
-      <w:proofErr w:type="spellStart"/>
-      <w:r>
-        <w:rPr>
-          <w:rFonts w:ascii="Times New Roman" w:hAnsi="Times New Roman" w:cs="Times New Roman"/>
-          <w:sz w:val="24"/>
-          <w:szCs w:val="24"/>
-        </w:rPr>
-        <w:t>elif</w:t>
-      </w:r>
-      <w:proofErr w:type="spellEnd"/>
-      <w:r>
-        <w:rPr>
-          <w:rFonts w:ascii="Times New Roman" w:hAnsi="Times New Roman" w:cs="Times New Roman"/>
-          <w:sz w:val="24"/>
-          <w:szCs w:val="24"/>
-        </w:rPr>
-        <w:t xml:space="preserve"> choice == "3":</w:t>
-      </w:r>
-    </w:p>
-    <w:p>
-      <w:pPr>
-        <w:spacing w:after="0" w:line="240" w:lineRule="auto"/>
-        <w:rPr>
-          <w:rFonts w:ascii="Times New Roman" w:hAnsi="Times New Roman" w:cs="Times New Roman"/>
-          <w:sz w:val="24"/>
-          <w:szCs w:val="24"/>
-        </w:rPr>
-      </w:pPr>
-      <w:r>
-        <w:rPr>
-          <w:rFonts w:ascii="Times New Roman" w:hAnsi="Times New Roman" w:cs="Times New Roman"/>
-          <w:sz w:val="24"/>
-          <w:szCs w:val="24"/>
-        </w:rPr>
-        <w:t>        if students:</w:t>
-      </w:r>
-    </w:p>
-    <w:p>
-      <w:pPr>
-        <w:spacing w:after="0" w:line="240" w:lineRule="auto"/>
-        <w:rPr>
-          <w:rFonts w:ascii="Times New Roman" w:hAnsi="Times New Roman" w:cs="Times New Roman"/>
-          <w:sz w:val="24"/>
-          <w:szCs w:val="24"/>
-        </w:rPr>
-      </w:pPr>
-      <w:r>
-        <w:rPr>
-          <w:rFonts w:ascii="Times New Roman" w:hAnsi="Times New Roman" w:cs="Times New Roman"/>
-          <w:sz w:val="24"/>
-          <w:szCs w:val="24"/>
-        </w:rPr>
-        <w:t xml:space="preserve">            </w:t>
-      </w:r>
-      <w:proofErr w:type="gramStart"/>
-      <w:r>
-        <w:rPr>
-          <w:rFonts w:ascii="Times New Roman" w:hAnsi="Times New Roman" w:cs="Times New Roman"/>
-          <w:sz w:val="24"/>
-          <w:szCs w:val="24"/>
-        </w:rPr>
-        <w:t>print(</w:t>
-      </w:r>
-      <w:proofErr w:type="gramEnd"/>
-      <w:r>
-        <w:rPr>
-          <w:rFonts w:ascii="Times New Roman" w:hAnsi="Times New Roman" w:cs="Times New Roman"/>
-          <w:sz w:val="24"/>
-          <w:szCs w:val="24"/>
-        </w:rPr>
-        <w:t>"\</w:t>
-      </w:r>
-      <w:proofErr w:type="spellStart"/>
-      <w:r>
-        <w:rPr>
-          <w:rFonts w:ascii="Times New Roman" w:hAnsi="Times New Roman" w:cs="Times New Roman"/>
-          <w:sz w:val="24"/>
-          <w:szCs w:val="24"/>
-        </w:rPr>
-        <w:t>nStudent</w:t>
-      </w:r>
-      <w:proofErr w:type="spellEnd"/>
-      <w:r>
-        <w:rPr>
-          <w:rFonts w:ascii="Times New Roman" w:hAnsi="Times New Roman" w:cs="Times New Roman"/>
-          <w:sz w:val="24"/>
-          <w:szCs w:val="24"/>
-        </w:rPr>
-        <w:t xml:space="preserve"> Grades:")</w:t>
-      </w:r>
-    </w:p>
-    <w:p>
-      <w:pPr>
-        <w:spacing w:after="0" w:line="240" w:lineRule="auto"/>
-        <w:rPr>
-          <w:rFonts w:ascii="Times New Roman" w:hAnsi="Times New Roman" w:cs="Times New Roman"/>
-          <w:sz w:val="24"/>
-          <w:szCs w:val="24"/>
-        </w:rPr>
-      </w:pPr>
-      <w:r>
-        <w:rPr>
-          <w:rFonts w:ascii="Times New Roman" w:hAnsi="Times New Roman" w:cs="Times New Roman"/>
-          <w:sz w:val="24"/>
-          <w:szCs w:val="24"/>
-        </w:rPr>
-        <w:t xml:space="preserve">            for name, grade in </w:t>
-      </w:r>
-      <w:proofErr w:type="spellStart"/>
-      <w:proofErr w:type="gramStart"/>
-      <w:r>
-        <w:rPr>
-          <w:rFonts w:ascii="Times New Roman" w:hAnsi="Times New Roman" w:cs="Times New Roman"/>
-          <w:sz w:val="24"/>
-          <w:szCs w:val="24"/>
-        </w:rPr>
-        <w:t>students.items</w:t>
-      </w:r>
-      <w:proofErr w:type="spellEnd"/>
-      <w:proofErr w:type="gramEnd"/>
-      <w:r>
-        <w:rPr>
-          <w:rFonts w:ascii="Times New Roman" w:hAnsi="Times New Roman" w:cs="Times New Roman"/>
-          <w:sz w:val="24"/>
-          <w:szCs w:val="24"/>
-        </w:rPr>
-        <w:t>():</w:t>
-      </w:r>
-    </w:p>
-    <w:p>
-      <w:pPr>
-        <w:spacing w:after="0" w:line="240" w:lineRule="auto"/>
-        <w:rPr>
-          <w:rFonts w:ascii="Times New Roman" w:hAnsi="Times New Roman" w:cs="Times New Roman"/>
-          <w:sz w:val="24"/>
-          <w:szCs w:val="24"/>
-        </w:rPr>
-      </w:pPr>
-      <w:r>
-        <w:rPr>
-          <w:rFonts w:ascii="Times New Roman" w:hAnsi="Times New Roman" w:cs="Times New Roman"/>
-          <w:sz w:val="24"/>
-          <w:szCs w:val="24"/>
-        </w:rPr>
-        <w:t xml:space="preserve">                </w:t>
-      </w:r>
-      <w:proofErr w:type="gramStart"/>
-      <w:r>
-        <w:rPr>
-          <w:rFonts w:ascii="Times New Roman" w:hAnsi="Times New Roman" w:cs="Times New Roman"/>
-          <w:sz w:val="24"/>
-          <w:szCs w:val="24"/>
-        </w:rPr>
-        <w:t>print(</w:t>
-      </w:r>
-      <w:proofErr w:type="gramEnd"/>
-      <w:r>
-        <w:rPr>
-          <w:rFonts w:ascii="Times New Roman" w:hAnsi="Times New Roman" w:cs="Times New Roman"/>
-          <w:sz w:val="24"/>
-          <w:szCs w:val="24"/>
-        </w:rPr>
-        <w:t>name, ":", grade)</w:t>
-      </w:r>
-    </w:p>
-    <w:p>
-      <w:pPr>
-        <w:spacing w:after="0" w:line="240" w:lineRule="auto"/>
-        <w:rPr>
-          <w:rFonts w:ascii="Times New Roman" w:hAnsi="Times New Roman" w:cs="Times New Roman"/>
-          <w:sz w:val="24"/>
-          <w:szCs w:val="24"/>
-        </w:rPr>
-      </w:pPr>
-      <w:r>
-        <w:rPr>
-          <w:rFonts w:ascii="Times New Roman" w:hAnsi="Times New Roman" w:cs="Times New Roman"/>
-          <w:sz w:val="24"/>
-          <w:szCs w:val="24"/>
-        </w:rPr>
-        <w:t>        else:</w:t>
-      </w:r>
-    </w:p>
-    <w:p>
-      <w:pPr>
-        <w:spacing w:after="0" w:line="240" w:lineRule="auto"/>
-        <w:rPr>
-          <w:rFonts w:ascii="Times New Roman" w:hAnsi="Times New Roman" w:cs="Times New Roman"/>
-          <w:sz w:val="24"/>
-          <w:szCs w:val="24"/>
-        </w:rPr>
-      </w:pPr>
-      <w:r>
-        <w:rPr>
-          <w:rFonts w:ascii="Times New Roman" w:hAnsi="Times New Roman" w:cs="Times New Roman"/>
-          <w:sz w:val="24"/>
-          <w:szCs w:val="24"/>
-        </w:rPr>
-        <w:t xml:space="preserve">            </w:t>
-      </w:r>
-      <w:proofErr w:type="gramStart"/>
-      <w:r>
-        <w:rPr>
-          <w:rFonts w:ascii="Times New Roman" w:hAnsi="Times New Roman" w:cs="Times New Roman"/>
-          <w:sz w:val="24"/>
-          <w:szCs w:val="24"/>
-        </w:rPr>
-        <w:t>print(</w:t>
-      </w:r>
-      <w:proofErr w:type="gramEnd"/>
-      <w:r>
-        <w:rPr>
-          <w:rFonts w:ascii="Times New Roman" w:hAnsi="Times New Roman" w:cs="Times New Roman"/>
-          <w:sz w:val="24"/>
-          <w:szCs w:val="24"/>
-        </w:rPr>
-        <w:t>"No students found.")</w:t>
-      </w:r>
-    </w:p>
-    <w:p>
-      <w:pPr>
-        <w:spacing w:after="0" w:line="240" w:lineRule="auto"/>
-        <w:rPr>
-          <w:rFonts w:ascii="Times New Roman" w:hAnsi="Times New Roman" w:cs="Times New Roman"/>
-          <w:sz w:val="24"/>
-          <w:szCs w:val="24"/>
-        </w:rPr>
-      </w:pPr>
-      <w:r>
-        <w:rPr>
-          <w:rFonts w:ascii="Times New Roman" w:hAnsi="Times New Roman" w:cs="Times New Roman"/>
-          <w:sz w:val="24"/>
-          <w:szCs w:val="24"/>
-        </w:rPr>
-        <w:t xml:space="preserve">    </w:t>
-      </w:r>
-      <w:proofErr w:type="spellStart"/>
-      <w:r>
-        <w:rPr>
-          <w:rFonts w:ascii="Times New Roman" w:hAnsi="Times New Roman" w:cs="Times New Roman"/>
-          <w:sz w:val="24"/>
-          <w:szCs w:val="24"/>
-        </w:rPr>
-        <w:t>elif</w:t>
-      </w:r>
-      <w:proofErr w:type="spellEnd"/>
-      <w:r>
-        <w:rPr>
-          <w:rFonts w:ascii="Times New Roman" w:hAnsi="Times New Roman" w:cs="Times New Roman"/>
-          <w:sz w:val="24"/>
-          <w:szCs w:val="24"/>
-        </w:rPr>
-        <w:t xml:space="preserve"> choice == "4":</w:t>
-      </w:r>
-    </w:p>
-    <w:p>
-      <w:pPr>
-        <w:spacing w:after="0" w:line="240" w:lineRule="auto"/>
-        <w:rPr>
-          <w:rFonts w:ascii="Times New Roman" w:hAnsi="Times New Roman" w:cs="Times New Roman"/>
-          <w:sz w:val="24"/>
-          <w:szCs w:val="24"/>
-        </w:rPr>
-      </w:pPr>
-      <w:r>
-        <w:rPr>
-          <w:rFonts w:ascii="Times New Roman" w:hAnsi="Times New Roman" w:cs="Times New Roman"/>
-          <w:sz w:val="24"/>
-          <w:szCs w:val="24"/>
-        </w:rPr>
-        <w:t xml:space="preserve">        </w:t>
-      </w:r>
-      <w:proofErr w:type="gramStart"/>
-      <w:r>
-        <w:rPr>
-          <w:rFonts w:ascii="Times New Roman" w:hAnsi="Times New Roman" w:cs="Times New Roman"/>
-          <w:sz w:val="24"/>
-          <w:szCs w:val="24"/>
-        </w:rPr>
-        <w:t>print(</w:t>
-      </w:r>
-      <w:proofErr w:type="gramEnd"/>
-      <w:r>
-        <w:rPr>
-          <w:rFonts w:ascii="Times New Roman" w:hAnsi="Times New Roman" w:cs="Times New Roman"/>
-          <w:sz w:val="24"/>
-          <w:szCs w:val="24"/>
-        </w:rPr>
-        <w:t>"Exiting program.")</w:t>
-      </w:r>
-    </w:p>
-    <w:p>
-      <w:pPr>
-        <w:spacing w:after="0" w:line="240" w:lineRule="auto"/>
-        <w:rPr>
-          <w:rFonts w:ascii="Times New Roman" w:hAnsi="Times New Roman" w:cs="Times New Roman"/>
-          <w:sz w:val="24"/>
-          <w:szCs w:val="24"/>
-        </w:rPr>
-      </w:pPr>
-      <w:r>
-        <w:rPr>
-          <w:rFonts w:ascii="Times New Roman" w:hAnsi="Times New Roman" w:cs="Times New Roman"/>
-          <w:sz w:val="24"/>
-          <w:szCs w:val="24"/>
-        </w:rPr>
-        <w:t>        break</w:t>
-      </w:r>
-    </w:p>
-    <w:p>
-      <w:pPr>
-        <w:spacing w:after="0" w:line="240" w:lineRule="auto"/>
-        <w:rPr>
-          <w:rFonts w:ascii="Times New Roman" w:hAnsi="Times New Roman" w:cs="Times New Roman"/>
-          <w:sz w:val="24"/>
-          <w:szCs w:val="24"/>
-        </w:rPr>
-      </w:pPr>
-      <w:r>
-        <w:rPr>
-          <w:rFonts w:ascii="Times New Roman" w:hAnsi="Times New Roman" w:cs="Times New Roman"/>
-          <w:sz w:val="24"/>
-          <w:szCs w:val="24"/>
-        </w:rPr>
-        <w:t>    else:</w:t>
-      </w:r>
-    </w:p>
-    <w:p>
-      <w:pPr>
-        <w:spacing w:after="0" w:line="240" w:lineRule="auto"/>
-        <w:rPr>
-          <w:rFonts w:ascii="Times New Roman" w:hAnsi="Times New Roman" w:cs="Times New Roman"/>
-          <w:sz w:val="24"/>
-          <w:szCs w:val="24"/>
-        </w:rPr>
-      </w:pPr>
-      <w:r>
-        <w:rPr>
-          <w:rFonts w:ascii="Times New Roman" w:hAnsi="Times New Roman" w:cs="Times New Roman"/>
-          <w:sz w:val="24"/>
-          <w:szCs w:val="24"/>
-        </w:rPr>
-        <w:t xml:space="preserve">        </w:t>
-      </w:r>
-      <w:proofErr w:type="gramStart"/>
-      <w:r>
-        <w:rPr>
-          <w:rFonts w:ascii="Times New Roman" w:hAnsi="Times New Roman" w:cs="Times New Roman"/>
-          <w:sz w:val="24"/>
-          <w:szCs w:val="24"/>
-        </w:rPr>
-        <w:t>print(</w:t>
-      </w:r>
-      <w:proofErr w:type="gramEnd"/>
-      <w:r>
-        <w:rPr>
-          <w:rFonts w:ascii="Times New Roman" w:hAnsi="Times New Roman" w:cs="Times New Roman"/>
-          <w:sz w:val="24"/>
-          <w:szCs w:val="24"/>
-        </w:rPr>
-        <w:t>"Invalid choice. Try again.")</w:t>
-      </w:r>
-    </w:p>
-    <w:p>
-      <w:pPr>
-        <w:spacing w:after="0" w:line="360" w:lineRule="auto"/>
-        <w:rPr>
-          <w:rFonts w:ascii="Times New Roman" w:hAnsi="Times New Roman" w:cs="Times New Roman"/>
-          <w:sz w:val="24"/>
-          <w:szCs w:val="24"/>
-        </w:rPr>
-      </w:pPr>
-    </w:p>
-    <w:p>
-      <w:pPr>
-        <w:spacing w:after="0" w:line="360" w:lineRule="auto"/>
-        <w:rPr>
-          <w:rFonts w:ascii="Times New Roman" w:hAnsi="Times New Roman" w:cs="Times New Roman"/>
-          <w:sz w:val="24"/>
-          <w:szCs w:val="24"/>
-        </w:rPr>
-      </w:pPr>
-    </w:p>
-    <w:p>
-      <w:pPr>
-        <w:spacing w:after="0" w:line="360" w:lineRule="auto"/>
-        <w:rPr>
-          <w:rFonts w:ascii="Times New Roman" w:hAnsi="Times New Roman" w:cs="Times New Roman"/>
-          <w:b/>
-          <w:bCs/>
-          <w:sz w:val="24"/>
-          <w:szCs w:val="24"/>
-        </w:rPr>
-      </w:pPr>
-    </w:p>
-    <w:p>
-      <w:pPr>
-        <w:spacing w:after="0" w:line="360" w:lineRule="auto"/>
-        <w:rPr>
-          <w:rFonts w:ascii="Times New Roman" w:hAnsi="Times New Roman" w:cs="Times New Roman"/>
-          <w:b/>
-          <w:bCs/>
-          <w:sz w:val="24"/>
-          <w:szCs w:val="24"/>
-        </w:rPr>
-      </w:pPr>
-      <w:r>
-        <w:rPr>
-          <w:rFonts w:ascii="Times New Roman" w:hAnsi="Times New Roman" w:cs="Times New Roman"/>
-          <w:b/>
-          <w:bCs/>
-          <w:sz w:val="24"/>
-          <w:szCs w:val="24"/>
-        </w:rPr>
-        <w:t>Used dictionary and basic operations. Using if else:</w:t>
-      </w:r>
-    </w:p>
-    <w:p>
-      <w:pPr>
-        <w:spacing w:after="0" w:line="360" w:lineRule="auto"/>
-        <w:rPr>
-          <w:rFonts w:ascii="Times New Roman" w:hAnsi="Times New Roman" w:cs="Times New Roman"/>
-          <w:b/>
-          <w:bCs/>
-          <w:sz w:val="24"/>
-          <w:szCs w:val="24"/>
-        </w:rPr>
-      </w:pPr>
-      <w:r>
-        <w:rPr>
-          <w:rFonts w:ascii="Times New Roman" w:hAnsi="Times New Roman" w:cs="Times New Roman"/>
-          <w:b/>
-          <w:bCs/>
-          <w:sz w:val="24"/>
-          <w:szCs w:val="24"/>
-        </w:rPr>
-        <w:t>3.Write to a File</w:t>
-      </w:r>
-    </w:p>
-    <w:p>
-      <w:pPr>
-        <w:spacing w:after="0" w:line="360" w:lineRule="auto"/>
-        <w:rPr>
-          <w:rFonts w:ascii="Times New Roman" w:hAnsi="Times New Roman" w:cs="Times New Roman"/>
-          <w:b/>
-          <w:bCs/>
-          <w:sz w:val="24"/>
-          <w:szCs w:val="24"/>
-        </w:rPr>
-      </w:pPr>
-      <w:r>
-        <w:rPr>
-          <w:rFonts w:ascii="Times New Roman" w:hAnsi="Times New Roman" w:cs="Times New Roman"/>
-          <w:b/>
-          <w:bCs/>
-          <w:sz w:val="24"/>
-          <w:szCs w:val="24"/>
-        </w:rPr>
-        <w:t>Write a program to create a text file and write some content to it.</w:t>
-      </w:r>
-    </w:p>
-    <w:p>
-      <w:pPr>
-        <w:spacing w:after="0" w:line="360" w:lineRule="auto"/>
-        <w:rPr>
-          <w:rFonts w:ascii="Times New Roman" w:hAnsi="Times New Roman" w:cs="Times New Roman"/>
-          <w:b/>
-          <w:bCs/>
-          <w:sz w:val="24"/>
-          <w:szCs w:val="24"/>
-        </w:rPr>
-      </w:pPr>
-      <w:r>
-        <w:rPr>
-          <w:rFonts w:ascii="Times New Roman" w:hAnsi="Times New Roman" w:cs="Times New Roman"/>
-          <w:b/>
-          <w:bCs/>
-          <w:sz w:val="24"/>
-          <w:szCs w:val="24"/>
-        </w:rPr>
-        <w:t>Ans:</w:t>
-      </w:r>
-    </w:p>
-    <w:p>
-      <w:pPr>
-        <w:spacing w:after="0" w:line="240" w:lineRule="auto"/>
-        <w:rPr>
-          <w:rFonts w:ascii="Times New Roman" w:hAnsi="Times New Roman" w:cs="Times New Roman"/>
-          <w:sz w:val="24"/>
-          <w:szCs w:val="24"/>
-        </w:rPr>
-      </w:pPr>
-      <w:r>
-        <w:rPr>
-          <w:rFonts w:ascii="Times New Roman" w:hAnsi="Times New Roman" w:cs="Times New Roman"/>
-          <w:sz w:val="24"/>
-          <w:szCs w:val="24"/>
-        </w:rPr>
-        <w:t xml:space="preserve">file = </w:t>
-      </w:r>
-      <w:proofErr w:type="gramStart"/>
-      <w:r>
-        <w:rPr>
-          <w:rFonts w:ascii="Times New Roman" w:hAnsi="Times New Roman" w:cs="Times New Roman"/>
-          <w:sz w:val="24"/>
-          <w:szCs w:val="24"/>
-        </w:rPr>
-        <w:t>open(</w:t>
-      </w:r>
-      <w:proofErr w:type="gramEnd"/>
-      <w:r>
-        <w:rPr>
-          <w:rFonts w:ascii="Times New Roman" w:hAnsi="Times New Roman" w:cs="Times New Roman"/>
-          <w:sz w:val="24"/>
-          <w:szCs w:val="24"/>
-        </w:rPr>
-        <w:t>"sample.txt", "w")</w:t>
-      </w:r>
-    </w:p>
-    <w:p>
-      <w:pPr>
-        <w:spacing w:after="0" w:line="240" w:lineRule="auto"/>
-        <w:rPr>
-          <w:rFonts w:ascii="Times New Roman" w:hAnsi="Times New Roman" w:cs="Times New Roman"/>
-          <w:sz w:val="24"/>
-          <w:szCs w:val="24"/>
-        </w:rPr>
-      </w:pPr>
-      <w:proofErr w:type="spellStart"/>
-      <w:proofErr w:type="gramStart"/>
-      <w:r>
-        <w:rPr>
-          <w:rFonts w:ascii="Times New Roman" w:hAnsi="Times New Roman" w:cs="Times New Roman"/>
-          <w:sz w:val="24"/>
-          <w:szCs w:val="24"/>
-        </w:rPr>
-        <w:t>file.write</w:t>
-      </w:r>
-      <w:proofErr w:type="spellEnd"/>
-      <w:proofErr w:type="gramEnd"/>
-      <w:r>
-        <w:rPr>
-          <w:rFonts w:ascii="Times New Roman" w:hAnsi="Times New Roman" w:cs="Times New Roman"/>
-          <w:sz w:val="24"/>
-          <w:szCs w:val="24"/>
-        </w:rPr>
-        <w:t>("Hello, this is a sample text file.\n")</w:t>
-      </w:r>
-    </w:p>
-    <w:p>
-      <w:pPr>
-        <w:spacing w:after="0" w:line="240" w:lineRule="auto"/>
-        <w:rPr>
-          <w:rFonts w:ascii="Times New Roman" w:hAnsi="Times New Roman" w:cs="Times New Roman"/>
-          <w:sz w:val="24"/>
-          <w:szCs w:val="24"/>
-        </w:rPr>
-      </w:pPr>
-      <w:proofErr w:type="spellStart"/>
-      <w:proofErr w:type="gramStart"/>
-      <w:r>
-        <w:rPr>
-          <w:rFonts w:ascii="Times New Roman" w:hAnsi="Times New Roman" w:cs="Times New Roman"/>
-          <w:sz w:val="24"/>
-          <w:szCs w:val="24"/>
-        </w:rPr>
-        <w:t>file.write</w:t>
-      </w:r>
-      <w:proofErr w:type="spellEnd"/>
-      <w:proofErr w:type="gramEnd"/>
-      <w:r>
-        <w:rPr>
-          <w:rFonts w:ascii="Times New Roman" w:hAnsi="Times New Roman" w:cs="Times New Roman"/>
-          <w:sz w:val="24"/>
-          <w:szCs w:val="24"/>
-        </w:rPr>
-        <w:t>("This content is written using Python.\n")</w:t>
-      </w:r>
-    </w:p>
-    <w:p>
-      <w:pPr>
-        <w:spacing w:after="0" w:line="240" w:lineRule="auto"/>
-        <w:rPr>
-          <w:rFonts w:ascii="Times New Roman" w:hAnsi="Times New Roman" w:cs="Times New Roman"/>
-          <w:sz w:val="24"/>
-          <w:szCs w:val="24"/>
-        </w:rPr>
-      </w:pPr>
-      <w:proofErr w:type="spellStart"/>
-      <w:proofErr w:type="gramStart"/>
-      <w:r>
-        <w:rPr>
-          <w:rFonts w:ascii="Times New Roman" w:hAnsi="Times New Roman" w:cs="Times New Roman"/>
-          <w:sz w:val="24"/>
-          <w:szCs w:val="24"/>
-        </w:rPr>
-        <w:t>file.close</w:t>
-      </w:r>
-      <w:proofErr w:type="spellEnd"/>
-      <w:proofErr w:type="gramEnd"/>
-      <w:r>
-        <w:rPr>
-          <w:rFonts w:ascii="Times New Roman" w:hAnsi="Times New Roman" w:cs="Times New Roman"/>
-          <w:sz w:val="24"/>
-          <w:szCs w:val="24"/>
-        </w:rPr>
-        <w:t>()</w:t>
-      </w:r>
-    </w:p>
-    <w:p>
-      <w:pPr>
-        <w:spacing w:after="0" w:line="240" w:lineRule="auto"/>
-        <w:rPr>
-          <w:rFonts w:ascii="Times New Roman" w:hAnsi="Times New Roman" w:cs="Times New Roman"/>
-          <w:sz w:val="24"/>
-          <w:szCs w:val="24"/>
-        </w:rPr>
-      </w:pPr>
-      <w:proofErr w:type="gramStart"/>
-      <w:r>
-        <w:rPr>
-          <w:rFonts w:ascii="Times New Roman" w:hAnsi="Times New Roman" w:cs="Times New Roman"/>
-          <w:sz w:val="24"/>
-          <w:szCs w:val="24"/>
-        </w:rPr>
-        <w:t>print(</w:t>
-      </w:r>
-      <w:proofErr w:type="gramEnd"/>
-      <w:r>
-        <w:rPr>
-          <w:rFonts w:ascii="Times New Roman" w:hAnsi="Times New Roman" w:cs="Times New Roman"/>
-          <w:sz w:val="24"/>
-          <w:szCs w:val="24"/>
-        </w:rPr>
         <w:t>"Content written to file successfully.")</w:t>
       </w:r>
-    </w:p>
-    <w:p>
-      <w:pPr>
-        <w:spacing w:after="0" w:line="360" w:lineRule="auto"/>
-        <w:rPr>
-          <w:rFonts w:ascii="Times New Roman" w:hAnsi="Times New Roman" w:cs="Times New Roman"/>
-          <w:sz w:val="24"/>
-          <w:szCs w:val="24"/>
-        </w:rPr>
-      </w:pPr>
     </w:p>
     <w:p>
       <w:pPr>
@@ -3004,6 +2952,7 @@
   <w:style w:type="character" w:default="1" w:styleId="DefaultParagraphFont">
     <w:name w:val="Default Paragraph Font"/>
     <w:uiPriority w:val="1"/>
+    <w:semiHidden/>
     <w:unhideWhenUsed/>
   </w:style>
   <w:style w:type="table" w:default="1" w:styleId="TableNormal">

</xml_diff>